<commit_message>
new oza sir study
</commit_message>
<xml_diff>
--- a/TheorynCoding/Study Material/Java Overall/Java Overall/Quick Java/oza sir/Merged_Team_Tech_Lead_Unique_Questions.docx
+++ b/TheorynCoding/Study Material/Java Overall/Java Overall/Quick Java/oza sir/Merged_Team_Tech_Lead_Unique_Questions.docx
@@ -1,6 +1,6 @@
 
 <file path=word/document.xml><?xml version="1.0" encoding="utf-8"?>
-<w:document xmlns:wpc="http://schemas.microsoft.com/office/word/2010/wordprocessingCanvas" xmlns:mo="http://schemas.microsoft.com/office/mac/office/2008/main" xmlns:mc="http://schemas.openxmlformats.org/markup-compatibility/2006" xmlns:mv="urn:schemas-microsoft-com:mac:vml" xmlns:o="urn:schemas-microsoft-com:office:office" xmlns:r="http://schemas.openxmlformats.org/officeDocument/2006/relationships" xmlns:m="http://schemas.openxmlformats.org/officeDocument/2006/math" xmlns:v="urn:schemas-microsoft-com:vml" xmlns:wp14="http://schemas.microsoft.com/office/word/2010/wordprocessingDrawing" xmlns:wp="http://schemas.openxmlformats.org/drawingml/2006/wordprocessingDrawing" xmlns:w10="urn:schemas-microsoft-com:office:word" xmlns:w="http://schemas.openxmlformats.org/wordprocessingml/2006/main" xmlns:w14="http://schemas.microsoft.com/office/word/2010/wordml" xmlns:wpg="http://schemas.microsoft.com/office/word/2010/wordprocessingGroup" xmlns:wpi="http://schemas.microsoft.com/office/word/2010/wordprocessingInk" xmlns:wne="http://schemas.microsoft.com/office/word/2006/wordml" xmlns:wps="http://schemas.microsoft.com/office/word/2010/wordprocessingShape" mc:Ignorable="w14 wp14">
+<w:document xmlns:wpc="http://schemas.microsoft.com/office/word/2010/wordprocessingCanvas" xmlns:mc="http://schemas.openxmlformats.org/markup-compatibility/2006" xmlns:o="urn:schemas-microsoft-com:office:office" xmlns:r="http://schemas.openxmlformats.org/officeDocument/2006/relationships" xmlns:m="http://schemas.openxmlformats.org/officeDocument/2006/math" xmlns:v="urn:schemas-microsoft-com:vml" xmlns:wp14="http://schemas.microsoft.com/office/word/2010/wordprocessingDrawing" xmlns:wp="http://schemas.openxmlformats.org/drawingml/2006/wordprocessingDrawing" xmlns:w10="urn:schemas-microsoft-com:office:word" xmlns:w="http://schemas.openxmlformats.org/wordprocessingml/2006/main" xmlns:w14="http://schemas.microsoft.com/office/word/2010/wordml" xmlns:wpg="http://schemas.microsoft.com/office/word/2010/wordprocessingGroup" xmlns:wpi="http://schemas.microsoft.com/office/word/2010/wordprocessingInk" xmlns:wne="http://schemas.microsoft.com/office/word/2006/wordml" xmlns:wps="http://schemas.microsoft.com/office/word/2010/wordprocessingShape" mc:Ignorable="w14 wp14">
   <w:body>
     <w:p>
       <w:r>
@@ -12,167 +12,446 @@
       </w:r>
     </w:p>
     <w:p>
-      <w:r>
-        <w:rPr>
-          <w:b/>
-        </w:rPr>
-        <w:t xml:space="preserve">Important: </w:t>
-      </w:r>
-      <w:r>
-        <w:t>Questions are preserved in their original wording. Duplicate/repeated versions have been removed; the original 29 questions supplied by the user are kept first.</w:t>
+      <w:pPr>
+        <w:pStyle w:val="Heading2"/>
+      </w:pPr>
+      <w:r>
+        <w:t>Question Set 1 — Architecture Fundamentals</w:t>
       </w:r>
     </w:p>
     <w:p>
       <w:pPr>
-        <w:pStyle w:val="Heading1"/>
-      </w:pPr>
-      <w:r>
-        <w:t>Original 29 Questions — Exactly as Provided</w:t>
+        <w:numPr>
+          <w:ilvl w:val="0"/>
+          <w:numId w:val="10"/>
+        </w:numPr>
+        <w:spacing w:before="100" w:beforeAutospacing="1" w:after="100" w:afterAutospacing="1" w:line="240" w:lineRule="auto"/>
+      </w:pPr>
+      <w:r>
+        <w:t xml:space="preserve">What is </w:t>
+      </w:r>
+      <w:r>
+        <w:rPr>
+          <w:rStyle w:val="Strong"/>
+        </w:rPr>
+        <w:t>Monolithic Architecture</w:t>
+      </w:r>
+      <w:r>
+        <w:t xml:space="preserve">? </w:t>
       </w:r>
     </w:p>
     <w:p>
-      <w:r>
-        <w:t>1. What are the design patterns used in microservices?</w:t>
+      <w:pPr>
+        <w:numPr>
+          <w:ilvl w:val="0"/>
+          <w:numId w:val="10"/>
+        </w:numPr>
+        <w:spacing w:before="100" w:beforeAutospacing="1" w:after="100" w:afterAutospacing="1" w:line="240" w:lineRule="auto"/>
+      </w:pPr>
+      <w:r>
+        <w:t xml:space="preserve">Explain the characteristics of Monolithic Architecture. </w:t>
       </w:r>
     </w:p>
     <w:p>
-      <w:r>
-        <w:t>2. What are the broad categories of design patterns used in microservices? and explain any 1 such category in detail.</w:t>
+      <w:pPr>
+        <w:numPr>
+          <w:ilvl w:val="0"/>
+          <w:numId w:val="10"/>
+        </w:numPr>
+        <w:spacing w:before="100" w:beforeAutospacing="1" w:after="100" w:afterAutospacing="1" w:line="240" w:lineRule="auto"/>
+      </w:pPr>
+      <w:r>
+        <w:t xml:space="preserve">What are the advantages of Monolithic Architecture? </w:t>
       </w:r>
     </w:p>
     <w:p>
-      <w:r>
-        <w:t>3. How do you expose the API Gateway to other microservices?</w:t>
+      <w:pPr>
+        <w:numPr>
+          <w:ilvl w:val="0"/>
+          <w:numId w:val="10"/>
+        </w:numPr>
+        <w:spacing w:before="100" w:beforeAutospacing="1" w:after="100" w:afterAutospacing="1" w:line="240" w:lineRule="auto"/>
+      </w:pPr>
+      <w:r>
+        <w:t xml:space="preserve">What are the disadvantages of Monolithic Architecture? </w:t>
       </w:r>
     </w:p>
     <w:p>
-      <w:r>
-        <w:t>4. How do you maintain session between different services in microservices?</w:t>
+      <w:pPr>
+        <w:numPr>
+          <w:ilvl w:val="0"/>
+          <w:numId w:val="10"/>
+        </w:numPr>
+        <w:spacing w:before="100" w:beforeAutospacing="1" w:after="100" w:afterAutospacing="1" w:line="240" w:lineRule="auto"/>
+      </w:pPr>
+      <w:r>
+        <w:t xml:space="preserve">Why is it difficult to scale a specific module in a monolithic application? </w:t>
       </w:r>
     </w:p>
     <w:p>
-      <w:r>
-        <w:t>5. What is the difference between JWT and OAuth/OAuth2?</w:t>
+      <w:pPr>
+        <w:numPr>
+          <w:ilvl w:val="0"/>
+          <w:numId w:val="10"/>
+        </w:numPr>
+        <w:spacing w:before="100" w:beforeAutospacing="1" w:after="100" w:afterAutospacing="1" w:line="240" w:lineRule="auto"/>
+      </w:pPr>
+      <w:r>
+        <w:t xml:space="preserve">What is </w:t>
+      </w:r>
+      <w:r>
+        <w:rPr>
+          <w:rStyle w:val="Strong"/>
+        </w:rPr>
+        <w:t>Vertical Scaling</w:t>
+      </w:r>
+      <w:r>
+        <w:t xml:space="preserve">? </w:t>
       </w:r>
     </w:p>
     <w:p>
-      <w:r>
-        <w:t>6. How do you monitor whether a service is down in a microservice setup? Provide realistic answer will take answer from devops team</w:t>
+      <w:pPr>
+        <w:numPr>
+          <w:ilvl w:val="0"/>
+          <w:numId w:val="10"/>
+        </w:numPr>
+        <w:spacing w:before="100" w:beforeAutospacing="1" w:after="100" w:afterAutospacing="1" w:line="240" w:lineRule="auto"/>
+      </w:pPr>
+      <w:r>
+        <w:t xml:space="preserve">What is </w:t>
+      </w:r>
+      <w:r>
+        <w:rPr>
+          <w:rStyle w:val="Strong"/>
+        </w:rPr>
+        <w:t>Horizontal Scaling</w:t>
+      </w:r>
+      <w:r>
+        <w:t xml:space="preserve">? </w:t>
       </w:r>
     </w:p>
     <w:p>
-      <w:r>
-        <w:t>7. What is your strategy to solve this problem: one/some of the services are down in a microservice setup? Provide realistic answer will take answer from devops team</w:t>
+      <w:pPr>
+        <w:numPr>
+          <w:ilvl w:val="0"/>
+          <w:numId w:val="10"/>
+        </w:numPr>
+        <w:spacing w:before="100" w:beforeAutospacing="1" w:after="100" w:afterAutospacing="1" w:line="240" w:lineRule="auto"/>
+      </w:pPr>
+      <w:r>
+        <w:t xml:space="preserve">What is the difference between Vertical Scaling and Horizontal Scaling? </w:t>
       </w:r>
     </w:p>
     <w:p>
-      <w:r>
-        <w:t>8. How do you define number-of-retires if a transaction fails in a series of transactions?</w:t>
+      <w:pPr>
+        <w:numPr>
+          <w:ilvl w:val="0"/>
+          <w:numId w:val="10"/>
+        </w:numPr>
+        <w:spacing w:before="100" w:beforeAutospacing="1" w:after="100" w:afterAutospacing="1" w:line="240" w:lineRule="auto"/>
+      </w:pPr>
+      <w:r>
+        <w:t xml:space="preserve">What is </w:t>
+      </w:r>
+      <w:r>
+        <w:rPr>
+          <w:rStyle w:val="Strong"/>
+        </w:rPr>
+        <w:t>Load Balancing</w:t>
+      </w:r>
+      <w:r>
+        <w:t xml:space="preserve">? </w:t>
       </w:r>
     </w:p>
     <w:p>
-      <w:r>
-        <w:t>9. What is a circuit breaker design pattern?</w:t>
+      <w:pPr>
+        <w:numPr>
+          <w:ilvl w:val="0"/>
+          <w:numId w:val="10"/>
+        </w:numPr>
+        <w:spacing w:before="100" w:beforeAutospacing="1" w:after="100" w:afterAutospacing="1" w:line="240" w:lineRule="auto"/>
+      </w:pPr>
+      <w:r>
+        <w:t xml:space="preserve">Why is load balancing difficult/less efficient in a monolithic application? </w:t>
       </w:r>
     </w:p>
     <w:p>
-      <w:r>
-        <w:t>10. What is propagation in transactions?</w:t>
+      <w:pPr>
+        <w:numPr>
+          <w:ilvl w:val="0"/>
+          <w:numId w:val="10"/>
+        </w:numPr>
+        <w:spacing w:before="100" w:beforeAutospacing="1" w:after="100" w:afterAutospacing="1" w:line="240" w:lineRule="auto"/>
+      </w:pPr>
+      <w:r>
+        <w:t xml:space="preserve">How does load balancing work in a microservices architecture? </w:t>
       </w:r>
     </w:p>
     <w:p>
-      <w:r>
-        <w:t>11. What is the difference between builder pattern and factory pattern?</w:t>
+      <w:pPr>
+        <w:numPr>
+          <w:ilvl w:val="0"/>
+          <w:numId w:val="10"/>
+        </w:numPr>
+        <w:spacing w:before="100" w:beforeAutospacing="1" w:after="100" w:afterAutospacing="1" w:line="240" w:lineRule="auto"/>
+      </w:pPr>
+      <w:r>
+        <w:t xml:space="preserve">What is a </w:t>
+      </w:r>
+      <w:r>
+        <w:rPr>
+          <w:rStyle w:val="Strong"/>
+        </w:rPr>
+        <w:t>Stateful application</w:t>
+      </w:r>
+      <w:r>
+        <w:t xml:space="preserve">? </w:t>
       </w:r>
     </w:p>
     <w:p>
-      <w:r>
-        <w:t>12. What things you need to take care if you are migrating a project from Java 6/7/8/9/11/16 to Java 17?</w:t>
+      <w:pPr>
+        <w:numPr>
+          <w:ilvl w:val="0"/>
+          <w:numId w:val="10"/>
+        </w:numPr>
+        <w:spacing w:before="100" w:beforeAutospacing="1" w:after="100" w:afterAutospacing="1" w:line="240" w:lineRule="auto"/>
+      </w:pPr>
+      <w:r>
+        <w:t xml:space="preserve">What is a </w:t>
+      </w:r>
+      <w:r>
+        <w:rPr>
+          <w:rStyle w:val="Strong"/>
+        </w:rPr>
+        <w:t>Stateless application</w:t>
+      </w:r>
+      <w:r>
+        <w:t xml:space="preserve">? </w:t>
       </w:r>
     </w:p>
     <w:p>
-      <w:r>
-        <w:t>13. How will you consume a ReST based API request and produce a SOAP based API request in a message broker application?</w:t>
+      <w:pPr>
+        <w:numPr>
+          <w:ilvl w:val="0"/>
+          <w:numId w:val="10"/>
+        </w:numPr>
+        <w:spacing w:before="100" w:beforeAutospacing="1" w:after="100" w:afterAutospacing="1" w:line="240" w:lineRule="auto"/>
+      </w:pPr>
+      <w:r>
+        <w:t xml:space="preserve">What is the difference between Stateful and Stateless applications? </w:t>
       </w:r>
     </w:p>
     <w:p>
-      <w:r>
-        <w:t>14. How is session managed in ReST and SOAP based web services?</w:t>
+      <w:pPr>
+        <w:numPr>
+          <w:ilvl w:val="0"/>
+          <w:numId w:val="10"/>
+        </w:numPr>
+        <w:spacing w:before="100" w:beforeAutospacing="1" w:after="100" w:afterAutospacing="1" w:line="240" w:lineRule="auto"/>
+      </w:pPr>
+      <w:r>
+        <w:t xml:space="preserve">Why are stateless services preferred in microservices? </w:t>
       </w:r>
     </w:p>
     <w:p>
-      <w:r>
-        <w:t>15. Can you use Hibernate without JPA? How do you convert an application using only Hibernate to JPA compliant application?</w:t>
+      <w:pPr>
+        <w:numPr>
+          <w:ilvl w:val="0"/>
+          <w:numId w:val="10"/>
+        </w:numPr>
+        <w:spacing w:before="100" w:beforeAutospacing="1" w:after="100" w:afterAutospacing="1" w:line="240" w:lineRule="auto"/>
+      </w:pPr>
+      <w:r>
+        <w:t xml:space="preserve">What is the difference between </w:t>
+      </w:r>
+      <w:r>
+        <w:rPr>
+          <w:rStyle w:val="Strong"/>
+        </w:rPr>
+        <w:t>Monolithic Architecture and Microservices Architecture</w:t>
+      </w:r>
+      <w:r>
+        <w:t xml:space="preserve">? </w:t>
       </w:r>
     </w:p>
     <w:p>
-      <w:r>
-        <w:t>16. Design an application stack where a mobile app and a web app share a common backend.</w:t>
+      <w:pPr>
+        <w:pStyle w:val="NormalWeb"/>
+      </w:pPr>
+      <w:r>
+        <w:t xml:space="preserve">The source specifically covers monolithic characteristics, scaling, vertical/horizontal scaling, load balancing, and stateful/stateless concepts. </w:t>
       </w:r>
     </w:p>
     <w:p>
       <w:r>
-        <w:t>17. What architecture / architectures have you used in your last project?</w:t>
+        <w:pict>
+          <v:rect id="_x0000_i1025" style="width:0;height:1.5pt" o:hralign="center" o:hrstd="t" o:hr="t" fillcolor="#a0a0a0" stroked="f"/>
+        </w:pict>
       </w:r>
     </w:p>
     <w:p>
-      <w:r>
-        <w:t>18. What is the difference between relational and hierarchical databases?</w:t>
+      <w:pPr>
+        <w:pStyle w:val="Heading1"/>
+      </w:pPr>
+      <w:r>
+        <w:t>Question Set 2 — Microservices Fundamentals</w:t>
       </w:r>
     </w:p>
     <w:p>
-      <w:r>
-        <w:t>19. When do you use relational or hierarchical or hybrid database?</w:t>
+      <w:pPr>
+        <w:numPr>
+          <w:ilvl w:val="0"/>
+          <w:numId w:val="11"/>
+        </w:numPr>
+        <w:spacing w:before="100" w:beforeAutospacing="1" w:after="100" w:afterAutospacing="1" w:line="240" w:lineRule="auto"/>
+      </w:pPr>
+      <w:r>
+        <w:t xml:space="preserve">What are Microservices? </w:t>
       </w:r>
     </w:p>
     <w:p>
-      <w:r>
-        <w:t>20. On which principle do the HashMap work?</w:t>
+      <w:pPr>
+        <w:numPr>
+          <w:ilvl w:val="0"/>
+          <w:numId w:val="11"/>
+        </w:numPr>
+        <w:spacing w:before="100" w:beforeAutospacing="1" w:after="100" w:afterAutospacing="1" w:line="240" w:lineRule="auto"/>
+      </w:pPr>
+      <w:r>
+        <w:t xml:space="preserve">What are the main characteristics of Microservices? </w:t>
       </w:r>
     </w:p>
     <w:p>
-      <w:r>
-        <w:t>21. Why Map is not a Collection in Java?</w:t>
+      <w:pPr>
+        <w:numPr>
+          <w:ilvl w:val="0"/>
+          <w:numId w:val="11"/>
+        </w:numPr>
+        <w:spacing w:before="100" w:beforeAutospacing="1" w:after="100" w:afterAutospacing="1" w:line="240" w:lineRule="auto"/>
+      </w:pPr>
+      <w:r>
+        <w:t xml:space="preserve">What are the advantages of Microservices? </w:t>
       </w:r>
     </w:p>
     <w:p>
-      <w:r>
-        <w:t>22. What will be your program if you want to insert millions of data in 1 million similar XML files into a database table?</w:t>
+      <w:pPr>
+        <w:numPr>
+          <w:ilvl w:val="0"/>
+          <w:numId w:val="11"/>
+        </w:numPr>
+        <w:spacing w:before="100" w:beforeAutospacing="1" w:after="100" w:afterAutospacing="1" w:line="240" w:lineRule="auto"/>
+      </w:pPr>
+      <w:r>
+        <w:t xml:space="preserve">How does Microservices architecture provide </w:t>
+      </w:r>
+      <w:r>
+        <w:rPr>
+          <w:rStyle w:val="Strong"/>
+        </w:rPr>
+        <w:t>fault isolation</w:t>
+      </w:r>
+      <w:r>
+        <w:t xml:space="preserve">? </w:t>
       </w:r>
     </w:p>
     <w:p>
-      <w:r>
-        <w:t>23. What are the steps in migrating data from a DBMS from one vendor to another DBMS from another vendor? Eg. Migrating from SQL Server 2019 to Oracle 21c</w:t>
+      <w:pPr>
+        <w:numPr>
+          <w:ilvl w:val="0"/>
+          <w:numId w:val="11"/>
+        </w:numPr>
+        <w:spacing w:before="100" w:beforeAutospacing="1" w:after="100" w:afterAutospacing="1" w:line="240" w:lineRule="auto"/>
+      </w:pPr>
+      <w:r>
+        <w:t xml:space="preserve">How does Microservices architecture provide </w:t>
+      </w:r>
+      <w:r>
+        <w:rPr>
+          <w:rStyle w:val="Strong"/>
+        </w:rPr>
+        <w:t>independent scaling</w:t>
+      </w:r>
+      <w:r>
+        <w:t xml:space="preserve">? </w:t>
       </w:r>
     </w:p>
     <w:p>
-      <w:r>
-        <w:t>24. How do you migrate an application from ActiveMQ or RabbitMQ to Kafka?</w:t>
+      <w:pPr>
+        <w:numPr>
+          <w:ilvl w:val="0"/>
+          <w:numId w:val="11"/>
+        </w:numPr>
+        <w:spacing w:before="100" w:beforeAutospacing="1" w:after="100" w:afterAutospacing="1" w:line="240" w:lineRule="auto"/>
+      </w:pPr>
+      <w:r>
+        <w:t xml:space="preserve">How does Microservices architecture support independent deployment? </w:t>
       </w:r>
     </w:p>
     <w:p>
-      <w:r>
-        <w:t>25. How do you select suitable / apt architecture, frameworks, platforms, engines, libraries, etc for any application/applications?</w:t>
+      <w:pPr>
+        <w:numPr>
+          <w:ilvl w:val="0"/>
+          <w:numId w:val="11"/>
+        </w:numPr>
+        <w:spacing w:before="100" w:beforeAutospacing="1" w:after="100" w:afterAutospacing="1" w:line="240" w:lineRule="auto"/>
+      </w:pPr>
+      <w:r>
+        <w:t xml:space="preserve">What problems can occur when one microservice goes down? </w:t>
       </w:r>
     </w:p>
     <w:p>
-      <w:r>
-        <w:t>26. What is the last major problem that you have solved with any project?</w:t>
+      <w:pPr>
+        <w:numPr>
+          <w:ilvl w:val="0"/>
+          <w:numId w:val="11"/>
+        </w:numPr>
+        <w:spacing w:before="100" w:beforeAutospacing="1" w:after="100" w:afterAutospacing="1" w:line="240" w:lineRule="auto"/>
+      </w:pPr>
+      <w:r>
+        <w:t xml:space="preserve">What is </w:t>
+      </w:r>
+      <w:r>
+        <w:rPr>
+          <w:rStyle w:val="Strong"/>
+        </w:rPr>
+        <w:t>Cascading Failure</w:t>
+      </w:r>
+      <w:r>
+        <w:t xml:space="preserve">? </w:t>
       </w:r>
     </w:p>
     <w:p>
-      <w:r>
-        <w:t>27. How do you solve this problem: a team member induced a bug in a code, but he/she is not available to resolve that bug? Provide own live example</w:t>
+      <w:pPr>
+        <w:numPr>
+          <w:ilvl w:val="0"/>
+          <w:numId w:val="11"/>
+        </w:numPr>
+        <w:spacing w:before="100" w:beforeAutospacing="1" w:after="100" w:afterAutospacing="1" w:line="240" w:lineRule="auto"/>
+      </w:pPr>
+      <w:r>
+        <w:t xml:space="preserve">How does cascading failure occur in Microservices? </w:t>
       </w:r>
     </w:p>
     <w:p>
-      <w:r>
-        <w:t>28. How do you resolve problems in live applications? Provide realistic answer will take answer from devops team</w:t>
+      <w:pPr>
+        <w:numPr>
+          <w:ilvl w:val="0"/>
+          <w:numId w:val="11"/>
+        </w:numPr>
+        <w:spacing w:before="100" w:beforeAutospacing="1" w:after="100" w:afterAutospacing="1" w:line="240" w:lineRule="auto"/>
+      </w:pPr>
+      <w:r>
+        <w:t xml:space="preserve">How can cascading failures be prevented? </w:t>
       </w:r>
     </w:p>
     <w:p>
-      <w:r>
-        <w:t>29. How do you optimize an existing application? Provide realistic answer will take answer from devops team</w:t>
+      <w:pPr>
+        <w:spacing w:after="0"/>
+      </w:pPr>
+      <w:r>
+        <w:pict>
+          <v:rect id="_x0000_i1026" style="width:0;height:1.5pt" o:hralign="center" o:hrstd="t" o:hr="t" fillcolor="#a0a0a0" stroked="f"/>
+        </w:pict>
       </w:r>
     </w:p>
     <w:p>
@@ -180,367 +459,2068 @@
         <w:pStyle w:val="Heading1"/>
       </w:pPr>
       <w:r>
-        <w:t>Additional Unique Questions from Uploaded Files</w:t>
+        <w:lastRenderedPageBreak/>
+        <w:t>Question Set 3 — Resilience &amp; Fault Tolerance</w:t>
       </w:r>
     </w:p>
     <w:p>
-      <w:r>
-        <w:t>1. What is the difference between DoP and SoD (delegation of power –vs– segregation of duties)?</w:t>
+      <w:pPr>
+        <w:numPr>
+          <w:ilvl w:val="0"/>
+          <w:numId w:val="12"/>
+        </w:numPr>
+        <w:spacing w:before="100" w:beforeAutospacing="1" w:after="100" w:afterAutospacing="1" w:line="240" w:lineRule="auto"/>
+      </w:pPr>
+      <w:r>
+        <w:t xml:space="preserve">What is the </w:t>
+      </w:r>
+      <w:r>
+        <w:rPr>
+          <w:rStyle w:val="Strong"/>
+        </w:rPr>
+        <w:t>Circuit Breaker Pattern</w:t>
+      </w:r>
+      <w:r>
+        <w:t xml:space="preserve">? </w:t>
       </w:r>
     </w:p>
     <w:p>
-      <w:r>
-        <w:t>2. Which AI based code generator you prefer to use and why?</w:t>
+      <w:pPr>
+        <w:numPr>
+          <w:ilvl w:val="0"/>
+          <w:numId w:val="12"/>
+        </w:numPr>
+        <w:spacing w:before="100" w:beforeAutospacing="1" w:after="100" w:afterAutospacing="1" w:line="240" w:lineRule="auto"/>
+      </w:pPr>
+      <w:r>
+        <w:t xml:space="preserve">Why do we need Circuit Breaker in Microservices? </w:t>
       </w:r>
     </w:p>
     <w:p>
-      <w:r>
-        <w:t>3. what are memory models in java?</w:t>
+      <w:pPr>
+        <w:numPr>
+          <w:ilvl w:val="0"/>
+          <w:numId w:val="12"/>
+        </w:numPr>
+        <w:spacing w:before="100" w:beforeAutospacing="1" w:after="100" w:afterAutospacing="1" w:line="240" w:lineRule="auto"/>
+      </w:pPr>
+      <w:r>
+        <w:t xml:space="preserve">What are the three states of Circuit Breaker? </w:t>
       </w:r>
     </w:p>
     <w:p>
-      <w:r>
-        <w:t>4. how heap memory model works?</w:t>
+      <w:pPr>
+        <w:numPr>
+          <w:ilvl w:val="0"/>
+          <w:numId w:val="12"/>
+        </w:numPr>
+        <w:spacing w:before="100" w:beforeAutospacing="1" w:after="100" w:afterAutospacing="1" w:line="240" w:lineRule="auto"/>
+      </w:pPr>
+      <w:r>
+        <w:t xml:space="preserve">Explain </w:t>
+      </w:r>
+      <w:r>
+        <w:rPr>
+          <w:rStyle w:val="Strong"/>
+        </w:rPr>
+        <w:t>CLOSED, OPEN and HALF-OPEN</w:t>
+      </w:r>
+      <w:r>
+        <w:t xml:space="preserve"> states. </w:t>
       </w:r>
     </w:p>
     <w:p>
-      <w:r>
-        <w:t>5. what are types of references in java?</w:t>
+      <w:pPr>
+        <w:numPr>
+          <w:ilvl w:val="0"/>
+          <w:numId w:val="12"/>
+        </w:numPr>
+        <w:spacing w:before="100" w:beforeAutospacing="1" w:after="100" w:afterAutospacing="1" w:line="240" w:lineRule="auto"/>
+      </w:pPr>
+      <w:r>
+        <w:t xml:space="preserve">What is a </w:t>
+      </w:r>
+      <w:r>
+        <w:rPr>
+          <w:rStyle w:val="Strong"/>
+        </w:rPr>
+        <w:t>Fallback</w:t>
+      </w:r>
+      <w:r>
+        <w:t xml:space="preserve">? </w:t>
       </w:r>
     </w:p>
     <w:p>
-      <w:r>
-        <w:t>6. counter question: why use weak-reference when garbage collection is a system heavy process?</w:t>
+      <w:pPr>
+        <w:numPr>
+          <w:ilvl w:val="0"/>
+          <w:numId w:val="12"/>
+        </w:numPr>
+        <w:spacing w:before="100" w:beforeAutospacing="1" w:after="100" w:afterAutospacing="1" w:line="240" w:lineRule="auto"/>
+      </w:pPr>
+      <w:r>
+        <w:t xml:space="preserve">What is a </w:t>
+      </w:r>
+      <w:r>
+        <w:rPr>
+          <w:rStyle w:val="Strong"/>
+        </w:rPr>
+        <w:t>Timeout</w:t>
+      </w:r>
+      <w:r>
+        <w:t xml:space="preserve"> in Microservices? </w:t>
       </w:r>
     </w:p>
     <w:p>
-      <w:r>
-        <w:t>7. counter question: what problems have you faced with weak-references?</w:t>
+      <w:pPr>
+        <w:numPr>
+          <w:ilvl w:val="0"/>
+          <w:numId w:val="12"/>
+        </w:numPr>
+        <w:spacing w:before="100" w:beforeAutospacing="1" w:after="100" w:afterAutospacing="1" w:line="240" w:lineRule="auto"/>
+      </w:pPr>
+      <w:r>
+        <w:t xml:space="preserve">How do you decide the timeout value? </w:t>
       </w:r>
     </w:p>
     <w:p>
-      <w:r>
-        <w:t>8. what are your views on string pool and immutability?</w:t>
+      <w:pPr>
+        <w:numPr>
+          <w:ilvl w:val="0"/>
+          <w:numId w:val="12"/>
+        </w:numPr>
+        <w:spacing w:before="100" w:beforeAutospacing="1" w:after="100" w:afterAutospacing="1" w:line="240" w:lineRule="auto"/>
+      </w:pPr>
+      <w:r>
+        <w:t xml:space="preserve">What is the relationship between Timeout and Circuit Breaker? </w:t>
       </w:r>
     </w:p>
     <w:p>
-      <w:r>
-        <w:t>9. counter-question: why key in HashMap needs to be immutable, and specially in string?</w:t>
+      <w:pPr>
+        <w:numPr>
+          <w:ilvl w:val="0"/>
+          <w:numId w:val="12"/>
+        </w:numPr>
+        <w:spacing w:before="100" w:beforeAutospacing="1" w:after="100" w:afterAutospacing="1" w:line="240" w:lineRule="auto"/>
+      </w:pPr>
+      <w:r>
+        <w:t xml:space="preserve">What is Retry? </w:t>
       </w:r>
     </w:p>
     <w:p>
-      <w:r>
-        <w:t>10. how to deploy a web application in WebSphere?</w:t>
+      <w:pPr>
+        <w:numPr>
+          <w:ilvl w:val="0"/>
+          <w:numId w:val="12"/>
+        </w:numPr>
+        <w:spacing w:before="100" w:beforeAutospacing="1" w:after="100" w:afterAutospacing="1" w:line="240" w:lineRule="auto"/>
+      </w:pPr>
+      <w:r>
+        <w:t xml:space="preserve">When should Retry be used? </w:t>
       </w:r>
     </w:p>
     <w:p>
-      <w:r>
-        <w:t>11. what are the changes in spring boot application to deploy it in WebSphere?</w:t>
+      <w:pPr>
+        <w:numPr>
+          <w:ilvl w:val="0"/>
+          <w:numId w:val="12"/>
+        </w:numPr>
+        <w:spacing w:before="100" w:beforeAutospacing="1" w:after="100" w:afterAutospacing="1" w:line="240" w:lineRule="auto"/>
+      </w:pPr>
+      <w:r>
+        <w:t xml:space="preserve">What is the difference between </w:t>
+      </w:r>
+      <w:r>
+        <w:rPr>
+          <w:rStyle w:val="Strong"/>
+        </w:rPr>
+        <w:t>Retry, Timeout, Circuit Breaker and Fallback</w:t>
+      </w:r>
+      <w:r>
+        <w:t xml:space="preserve">? </w:t>
       </w:r>
     </w:p>
     <w:p>
-      <w:r>
-        <w:t>12. what are the changes in spring servlet to deploy spring boot application in WebSphere?</w:t>
+      <w:pPr>
+        <w:numPr>
+          <w:ilvl w:val="0"/>
+          <w:numId w:val="12"/>
+        </w:numPr>
+        <w:spacing w:before="100" w:beforeAutospacing="1" w:after="100" w:afterAutospacing="1" w:line="240" w:lineRule="auto"/>
+      </w:pPr>
+      <w:r>
+        <w:t xml:space="preserve">How can Retry cause a cascading failure? </w:t>
       </w:r>
     </w:p>
     <w:p>
-      <w:r>
-        <w:t>13. what are the changes in JPA to deploy spring boot application in WebSphere?</w:t>
+      <w:pPr>
+        <w:numPr>
+          <w:ilvl w:val="0"/>
+          <w:numId w:val="12"/>
+        </w:numPr>
+        <w:spacing w:before="100" w:beforeAutospacing="1" w:after="100" w:afterAutospacing="1" w:line="240" w:lineRule="auto"/>
+      </w:pPr>
+      <w:r>
+        <w:t xml:space="preserve">How does Circuit Breaker prevent cascading failure? </w:t>
       </w:r>
     </w:p>
     <w:p>
-      <w:r>
-        <w:t>14. how are exceptions handled in spring boot?</w:t>
+      <w:pPr>
+        <w:pStyle w:val="NormalWeb"/>
+      </w:pPr>
+      <w:r>
+        <w:t xml:space="preserve">The source explicitly covers Circuit Breaker, its states, fallback, cascading failure and timeout selection. </w:t>
       </w:r>
     </w:p>
     <w:p>
       <w:r>
-        <w:t>15. what is @ExceptionHandler annotation?</w:t>
+        <w:pict>
+          <v:rect id="_x0000_i1027" style="width:0;height:1.5pt" o:hralign="center" o:hrstd="t" o:hr="t" fillcolor="#a0a0a0" stroked="f"/>
+        </w:pict>
       </w:r>
     </w:p>
     <w:p>
-      <w:r>
-        <w:t>16. what is the difference between bean and component in spring?</w:t>
+      <w:pPr>
+        <w:pStyle w:val="Heading1"/>
+      </w:pPr>
+      <w:r>
+        <w:t>Question Set 4 — Service Discovery</w:t>
       </w:r>
     </w:p>
     <w:p>
-      <w:r>
-        <w:t>17. which IDE have u used for spring + WebSphere development?</w:t>
+      <w:pPr>
+        <w:numPr>
+          <w:ilvl w:val="0"/>
+          <w:numId w:val="13"/>
+        </w:numPr>
+        <w:spacing w:before="100" w:beforeAutospacing="1" w:after="100" w:afterAutospacing="1" w:line="240" w:lineRule="auto"/>
+      </w:pPr>
+      <w:r>
+        <w:t xml:space="preserve">What is </w:t>
+      </w:r>
+      <w:r>
+        <w:rPr>
+          <w:rStyle w:val="Strong"/>
+        </w:rPr>
+        <w:t>Service Discovery</w:t>
+      </w:r>
+      <w:r>
+        <w:t xml:space="preserve">? </w:t>
       </w:r>
     </w:p>
     <w:p>
-      <w:r>
-        <w:t>18. what is the strategy you use to consume rest-based web services?</w:t>
+      <w:pPr>
+        <w:numPr>
+          <w:ilvl w:val="0"/>
+          <w:numId w:val="13"/>
+        </w:numPr>
+        <w:spacing w:before="100" w:beforeAutospacing="1" w:after="100" w:afterAutospacing="1" w:line="240" w:lineRule="auto"/>
+      </w:pPr>
+      <w:r>
+        <w:t xml:space="preserve">Why do we need Service Discovery in Microservices? </w:t>
       </w:r>
     </w:p>
     <w:p>
-      <w:r>
-        <w:t>19. counter question: what do you use in application - rest-template or feign-client and why?</w:t>
+      <w:pPr>
+        <w:numPr>
+          <w:ilvl w:val="0"/>
+          <w:numId w:val="13"/>
+        </w:numPr>
+        <w:spacing w:before="100" w:beforeAutospacing="1" w:after="100" w:afterAutospacing="1" w:line="240" w:lineRule="auto"/>
+      </w:pPr>
+      <w:r>
+        <w:t xml:space="preserve">What problem occurs if service URLs are hardcoded? </w:t>
       </w:r>
     </w:p>
     <w:p>
-      <w:r>
-        <w:t>20. what are the different types of AJAX calls in JavaScript?</w:t>
+      <w:pPr>
+        <w:numPr>
+          <w:ilvl w:val="0"/>
+          <w:numId w:val="13"/>
+        </w:numPr>
+        <w:spacing w:before="100" w:beforeAutospacing="1" w:after="100" w:afterAutospacing="1" w:line="240" w:lineRule="auto"/>
+      </w:pPr>
+      <w:r>
+        <w:t xml:space="preserve">What is a </w:t>
+      </w:r>
+      <w:r>
+        <w:rPr>
+          <w:rStyle w:val="Strong"/>
+        </w:rPr>
+        <w:t>Service Registry</w:t>
+      </w:r>
+      <w:r>
+        <w:t xml:space="preserve">? </w:t>
       </w:r>
     </w:p>
     <w:p>
-      <w:r>
-        <w:t>21. what are http status codes 4xx and 5xx series?</w:t>
+      <w:pPr>
+        <w:numPr>
+          <w:ilvl w:val="0"/>
+          <w:numId w:val="13"/>
+        </w:numPr>
+        <w:spacing w:before="100" w:beforeAutospacing="1" w:after="100" w:afterAutospacing="1" w:line="240" w:lineRule="auto"/>
+      </w:pPr>
+      <w:r>
+        <w:t xml:space="preserve">What is </w:t>
+      </w:r>
+      <w:r>
+        <w:rPr>
+          <w:rStyle w:val="Strong"/>
+        </w:rPr>
+        <w:t>Eureka Server</w:t>
+      </w:r>
+      <w:r>
+        <w:t xml:space="preserve">? </w:t>
       </w:r>
     </w:p>
     <w:p>
-      <w:r>
-        <w:t>22. how will you authorize get request?</w:t>
+      <w:pPr>
+        <w:numPr>
+          <w:ilvl w:val="0"/>
+          <w:numId w:val="13"/>
+        </w:numPr>
+        <w:spacing w:before="100" w:beforeAutospacing="1" w:after="100" w:afterAutospacing="1" w:line="240" w:lineRule="auto"/>
+      </w:pPr>
+      <w:r>
+        <w:t xml:space="preserve">How does Eureka Service Discovery work? </w:t>
       </w:r>
     </w:p>
     <w:p>
-      <w:r>
-        <w:t>23. how will you use AES and RSA public key to secure login between client and server?</w:t>
+      <w:pPr>
+        <w:numPr>
+          <w:ilvl w:val="0"/>
+          <w:numId w:val="13"/>
+        </w:numPr>
+        <w:spacing w:before="100" w:beforeAutospacing="1" w:after="100" w:afterAutospacing="1" w:line="240" w:lineRule="auto"/>
+      </w:pPr>
+      <w:r>
+        <w:t xml:space="preserve">What happens when a microservice starts? </w:t>
       </w:r>
     </w:p>
     <w:p>
-      <w:r>
-        <w:t>24. what is the cycle of payment in online payments?</w:t>
+      <w:pPr>
+        <w:numPr>
+          <w:ilvl w:val="0"/>
+          <w:numId w:val="13"/>
+        </w:numPr>
+        <w:spacing w:before="100" w:beforeAutospacing="1" w:after="100" w:afterAutospacing="1" w:line="240" w:lineRule="auto"/>
+      </w:pPr>
+      <w:r>
+        <w:t xml:space="preserve">How does a service register itself with Eureka? </w:t>
       </w:r>
     </w:p>
     <w:p>
-      <w:r>
-        <w:t>25. in how many ways and how can you apply style in any tag in html?</w:t>
+      <w:pPr>
+        <w:numPr>
+          <w:ilvl w:val="0"/>
+          <w:numId w:val="13"/>
+        </w:numPr>
+        <w:spacing w:before="100" w:beforeAutospacing="1" w:after="100" w:afterAutospacing="1" w:line="240" w:lineRule="auto"/>
+      </w:pPr>
+      <w:r>
+        <w:t xml:space="preserve">How does one microservice find another microservice? </w:t>
       </w:r>
     </w:p>
     <w:p>
-      <w:r>
-        <w:t>26. how will you create a table in oracle and PostgreSQL? what are some differences?</w:t>
+      <w:pPr>
+        <w:numPr>
+          <w:ilvl w:val="0"/>
+          <w:numId w:val="13"/>
+        </w:numPr>
+        <w:spacing w:before="100" w:beforeAutospacing="1" w:after="100" w:afterAutospacing="1" w:line="240" w:lineRule="auto"/>
+      </w:pPr>
+      <w:r>
+        <w:t xml:space="preserve">What is the role of </w:t>
+      </w:r>
+      <w:r>
+        <w:rPr>
+          <w:rStyle w:val="Strong"/>
+        </w:rPr>
+        <w:t>Consul</w:t>
+      </w:r>
+      <w:r>
+        <w:t xml:space="preserve">? </w:t>
       </w:r>
     </w:p>
     <w:p>
-      <w:r>
-        <w:t>27. what are the differences between select-with-join and views in PL/SQL?</w:t>
+      <w:pPr>
+        <w:numPr>
+          <w:ilvl w:val="0"/>
+          <w:numId w:val="13"/>
+        </w:numPr>
+        <w:spacing w:before="100" w:beforeAutospacing="1" w:after="100" w:afterAutospacing="1" w:line="240" w:lineRule="auto"/>
+      </w:pPr>
+      <w:r>
+        <w:t xml:space="preserve">What is the difference between static service configuration and dynamic service discovery? </w:t>
       </w:r>
     </w:p>
     <w:p>
-      <w:r>
-        <w:t>28. what are the differences between procedures and functions in PL/SQL?</w:t>
+      <w:pPr>
+        <w:numPr>
+          <w:ilvl w:val="0"/>
+          <w:numId w:val="13"/>
+        </w:numPr>
+        <w:spacing w:before="100" w:beforeAutospacing="1" w:after="100" w:afterAutospacing="1" w:line="240" w:lineRule="auto"/>
+      </w:pPr>
+      <w:r>
+        <w:t xml:space="preserve">How does </w:t>
+      </w:r>
+      <w:r>
+        <w:rPr>
+          <w:rStyle w:val="Strong"/>
+        </w:rPr>
+        <w:t>Feign Client work with Eureka</w:t>
+      </w:r>
+      <w:r>
+        <w:t xml:space="preserve">? </w:t>
       </w:r>
     </w:p>
     <w:p>
-      <w:r>
-        <w:t>29. if you have to update many rows per second in tables in 2 different database servers A and B such that data in server A should be immediately updated in server B, how will you do it?</w:t>
+      <w:pPr>
+        <w:numPr>
+          <w:ilvl w:val="0"/>
+          <w:numId w:val="13"/>
+        </w:numPr>
+        <w:spacing w:before="100" w:beforeAutospacing="1" w:after="100" w:afterAutospacing="1" w:line="240" w:lineRule="auto"/>
+      </w:pPr>
+      <w:r>
+        <w:t xml:space="preserve">How does Service Discovery help when services are scaled horizontally? </w:t>
       </w:r>
     </w:p>
     <w:p>
-      <w:r>
-        <w:t>30. counter-question: what if you cannot write trigger in method 2?</w:t>
+      <w:pPr>
+        <w:pStyle w:val="NormalWeb"/>
+      </w:pPr>
+      <w:r>
+        <w:t xml:space="preserve">The source describes Eureka/Consul, registration, discovery, dynamic service locations and Feign integration. </w:t>
       </w:r>
     </w:p>
     <w:p>
       <w:r>
-        <w:t>31. what do you prefer for scheduled jobs to database table updates? spring scheduler or cron job or anything else?</w:t>
+        <w:pict>
+          <v:rect id="_x0000_i1028" style="width:0;height:1.5pt" o:hralign="center" o:hrstd="t" o:hr="t" fillcolor="#a0a0a0" stroked="f"/>
+        </w:pict>
       </w:r>
     </w:p>
     <w:p>
-      <w:r>
-        <w:t>32. what is the use of rate-limiting in the web servers?</w:t>
+      <w:pPr>
+        <w:pStyle w:val="Heading1"/>
+      </w:pPr>
+      <w:r>
+        <w:lastRenderedPageBreak/>
+        <w:t>Question Set 5 — Complete Microservices Request Flow</w:t>
       </w:r>
     </w:p>
     <w:p>
-      <w:r>
-        <w:t>33. how to fetch data in JSP from database without using java code at all? do you know how to use JSTL for this?</w:t>
+      <w:pPr>
+        <w:numPr>
+          <w:ilvl w:val="0"/>
+          <w:numId w:val="14"/>
+        </w:numPr>
+        <w:spacing w:before="100" w:beforeAutospacing="1" w:after="100" w:afterAutospacing="1" w:line="240" w:lineRule="auto"/>
+      </w:pPr>
+      <w:r>
+        <w:t xml:space="preserve">Explain the complete request flow in a Microservices architecture. </w:t>
       </w:r>
     </w:p>
     <w:p>
-      <w:r>
-        <w:t>34. Can you use Hibernate without JPA?</w:t>
+      <w:pPr>
+        <w:numPr>
+          <w:ilvl w:val="0"/>
+          <w:numId w:val="14"/>
+        </w:numPr>
+        <w:spacing w:before="100" w:beforeAutospacing="1" w:after="100" w:afterAutospacing="1" w:line="240" w:lineRule="auto"/>
+      </w:pPr>
+      <w:r>
+        <w:t xml:space="preserve">What happens when a request first reaches the </w:t>
+      </w:r>
+      <w:r>
+        <w:rPr>
+          <w:rStyle w:val="Strong"/>
+        </w:rPr>
+        <w:t>API Gateway</w:t>
+      </w:r>
+      <w:r>
+        <w:t xml:space="preserve">? </w:t>
       </w:r>
     </w:p>
     <w:p>
-      <w:r>
-        <w:t>35. How do you convert an application using only Hibernate to JPA compliant application?</w:t>
+      <w:pPr>
+        <w:numPr>
+          <w:ilvl w:val="0"/>
+          <w:numId w:val="14"/>
+        </w:numPr>
+        <w:spacing w:before="100" w:beforeAutospacing="1" w:after="100" w:afterAutospacing="1" w:line="240" w:lineRule="auto"/>
+      </w:pPr>
+      <w:r>
+        <w:t xml:space="preserve">What is the role of </w:t>
+      </w:r>
+      <w:r>
+        <w:rPr>
+          <w:rStyle w:val="Strong"/>
+        </w:rPr>
+        <w:t>JWT validation</w:t>
+      </w:r>
+      <w:r>
+        <w:t xml:space="preserve"> in the API Gateway? </w:t>
       </w:r>
     </w:p>
     <w:p>
-      <w:r>
-        <w:t>36. What happens in String.substring() method?</w:t>
+      <w:pPr>
+        <w:numPr>
+          <w:ilvl w:val="0"/>
+          <w:numId w:val="14"/>
+        </w:numPr>
+        <w:spacing w:before="100" w:beforeAutospacing="1" w:after="100" w:afterAutospacing="1" w:line="240" w:lineRule="auto"/>
+      </w:pPr>
+      <w:r>
+        <w:t xml:space="preserve">How does API Gateway find the target microservice? </w:t>
       </w:r>
     </w:p>
     <w:p>
-      <w:r>
-        <w:t>37. Why we use byte[] instead of String in cryptology classes and methods?</w:t>
+      <w:pPr>
+        <w:numPr>
+          <w:ilvl w:val="0"/>
+          <w:numId w:val="14"/>
+        </w:numPr>
+        <w:spacing w:before="100" w:beforeAutospacing="1" w:after="100" w:afterAutospacing="1" w:line="240" w:lineRule="auto"/>
+      </w:pPr>
+      <w:r>
+        <w:t xml:space="preserve">What is the role of </w:t>
+      </w:r>
+      <w:r>
+        <w:rPr>
+          <w:rStyle w:val="Strong"/>
+        </w:rPr>
+        <w:t>Eureka</w:t>
+      </w:r>
+      <w:r>
+        <w:t xml:space="preserve"> in the request flow? </w:t>
       </w:r>
     </w:p>
     <w:p>
-      <w:r>
-        <w:t>38. Why Java is not an object-oriented programming language?</w:t>
+      <w:pPr>
+        <w:numPr>
+          <w:ilvl w:val="0"/>
+          <w:numId w:val="14"/>
+        </w:numPr>
+        <w:spacing w:before="100" w:beforeAutospacing="1" w:after="100" w:afterAutospacing="1" w:line="240" w:lineRule="auto"/>
+      </w:pPr>
+      <w:r>
+        <w:t xml:space="preserve">What happens when the request reaches the target microservice? </w:t>
       </w:r>
     </w:p>
     <w:p>
-      <w:r>
-        <w:t>39. What is Java?</w:t>
+      <w:pPr>
+        <w:numPr>
+          <w:ilvl w:val="0"/>
+          <w:numId w:val="14"/>
+        </w:numPr>
+        <w:spacing w:before="100" w:beforeAutospacing="1" w:after="100" w:afterAutospacing="1" w:line="240" w:lineRule="auto"/>
+      </w:pPr>
+      <w:r>
+        <w:t xml:space="preserve">What is the role of </w:t>
+      </w:r>
+      <w:r>
+        <w:rPr>
+          <w:rStyle w:val="Strong"/>
+        </w:rPr>
+        <w:t>DispatcherServlet</w:t>
+      </w:r>
+      <w:r>
+        <w:t xml:space="preserve">? </w:t>
       </w:r>
     </w:p>
     <w:p>
-      <w:r>
-        <w:t>40. Spring Boot / Spring Framework: What are the types of components in spring framework?</w:t>
+      <w:pPr>
+        <w:numPr>
+          <w:ilvl w:val="0"/>
+          <w:numId w:val="14"/>
+        </w:numPr>
+        <w:spacing w:before="100" w:beforeAutospacing="1" w:after="100" w:afterAutospacing="1" w:line="240" w:lineRule="auto"/>
+      </w:pPr>
+      <w:r>
+        <w:t xml:space="preserve">How does DispatcherServlet identify the Controller? </w:t>
       </w:r>
     </w:p>
     <w:p>
-      <w:r>
-        <w:t>41. How do you migrate a working monolithic project in Java 21(or any latest stable version) to a microservice project?</w:t>
+      <w:pPr>
+        <w:numPr>
+          <w:ilvl w:val="0"/>
+          <w:numId w:val="14"/>
+        </w:numPr>
+        <w:spacing w:before="100" w:beforeAutospacing="1" w:after="100" w:afterAutospacing="1" w:line="240" w:lineRule="auto"/>
+      </w:pPr>
+      <w:r>
+        <w:t xml:space="preserve">What happens after the Controller receives the request? </w:t>
       </w:r>
     </w:p>
     <w:p>
-      <w:r>
-        <w:t>42. What is a Service?</w:t>
+      <w:pPr>
+        <w:numPr>
+          <w:ilvl w:val="0"/>
+          <w:numId w:val="14"/>
+        </w:numPr>
+        <w:spacing w:before="100" w:beforeAutospacing="1" w:after="100" w:afterAutospacing="1" w:line="240" w:lineRule="auto"/>
+      </w:pPr>
+      <w:r>
+        <w:t xml:space="preserve">What is the role of </w:t>
+      </w:r>
+      <w:r>
+        <w:rPr>
+          <w:rStyle w:val="Strong"/>
+        </w:rPr>
+        <w:t>Feign Client</w:t>
+      </w:r>
+      <w:r>
+        <w:t xml:space="preserve">? </w:t>
       </w:r>
     </w:p>
     <w:p>
-      <w:r>
-        <w:t>43. Do you plan to stay with this company very-long/forever?</w:t>
+      <w:pPr>
+        <w:numPr>
+          <w:ilvl w:val="0"/>
+          <w:numId w:val="14"/>
+        </w:numPr>
+        <w:spacing w:before="100" w:beforeAutospacing="1" w:after="100" w:afterAutospacing="1" w:line="240" w:lineRule="auto"/>
+      </w:pPr>
+      <w:r>
+        <w:t xml:space="preserve">How does Feign Client communicate with another microservice? </w:t>
       </w:r>
     </w:p>
     <w:p>
-      <w:r>
-        <w:t>44. “How do you maintain session in ReST?”; but ReST has no concept of session.</w:t>
+      <w:pPr>
+        <w:numPr>
+          <w:ilvl w:val="0"/>
+          <w:numId w:val="14"/>
+        </w:numPr>
+        <w:spacing w:before="100" w:beforeAutospacing="1" w:after="100" w:afterAutospacing="1" w:line="240" w:lineRule="auto"/>
+      </w:pPr>
+      <w:r>
+        <w:t xml:space="preserve">How does Feign Client use Service Discovery? </w:t>
       </w:r>
     </w:p>
     <w:p>
-      <w:r>
-        <w:t>45. “How do you define retry-counts in Circuit-Breaker?”; but there is no retry in Circuit-Breaker.</w:t>
+      <w:pPr>
+        <w:numPr>
+          <w:ilvl w:val="0"/>
+          <w:numId w:val="14"/>
+        </w:numPr>
+        <w:spacing w:before="100" w:beforeAutospacing="1" w:after="100" w:afterAutospacing="1" w:line="240" w:lineRule="auto"/>
+      </w:pPr>
+      <w:r>
+        <w:t xml:space="preserve">Explain the complete flow: </w:t>
       </w:r>
     </w:p>
     <w:p>
-      <w:r>
-        <w:t>46. “If i delete from child table, then how will you manage the effect on the parent table?”; but deletion from child table has no effect on parent table.</w:t>
+      <w:pPr>
+        <w:pStyle w:val="HTMLPreformatted"/>
+        <w:rPr>
+          <w:rStyle w:val="HTMLCode"/>
+        </w:rPr>
+      </w:pPr>
+      <w:r>
+        <w:rPr>
+          <w:rStyle w:val="HTMLCode"/>
+        </w:rPr>
+        <w:t>Client</w:t>
       </w:r>
     </w:p>
     <w:p>
-      <w:r>
-        <w:t>47. 1MS=1DB OR 1MS=1schema OR N-MS=M-schemas OR All-MS=1DB?</w:t>
+      <w:pPr>
+        <w:pStyle w:val="HTMLPreformatted"/>
+        <w:rPr>
+          <w:rStyle w:val="HTMLCode"/>
+        </w:rPr>
+      </w:pPr>
+      <w:r>
+        <w:rPr>
+          <w:rStyle w:val="HTMLCode"/>
+        </w:rPr>
+        <w:t xml:space="preserve">   ↓</w:t>
       </w:r>
     </w:p>
     <w:p>
-      <w:r>
-        <w:t>48. How do you create new database in Oracle Express?</w:t>
+      <w:pPr>
+        <w:pStyle w:val="HTMLPreformatted"/>
+        <w:rPr>
+          <w:rStyle w:val="HTMLCode"/>
+        </w:rPr>
+      </w:pPr>
+      <w:r>
+        <w:rPr>
+          <w:rStyle w:val="HTMLCode"/>
+        </w:rPr>
+        <w:t>API Gateway</w:t>
       </w:r>
     </w:p>
     <w:p>
-      <w:r>
-        <w:t>49. How do you manage cookies/session in ReST?</w:t>
+      <w:pPr>
+        <w:pStyle w:val="HTMLPreformatted"/>
+        <w:rPr>
+          <w:rStyle w:val="HTMLCode"/>
+        </w:rPr>
+      </w:pPr>
+      <w:r>
+        <w:rPr>
+          <w:rStyle w:val="HTMLCode"/>
+        </w:rPr>
+        <w:t xml:space="preserve">   ↓</w:t>
       </w:r>
     </w:p>
     <w:p>
-      <w:r>
-        <w:t>50. How do you define retry-counts in Circuit-Breaker?</w:t>
+      <w:pPr>
+        <w:pStyle w:val="HTMLPreformatted"/>
+        <w:rPr>
+          <w:rStyle w:val="HTMLCode"/>
+        </w:rPr>
+      </w:pPr>
+      <w:r>
+        <w:rPr>
+          <w:rStyle w:val="HTMLCode"/>
+        </w:rPr>
+        <w:t>JWT Validation</w:t>
       </w:r>
     </w:p>
     <w:p>
-      <w:r>
-        <w:t>51. Why API Gateway Needed?</w:t>
+      <w:pPr>
+        <w:pStyle w:val="HTMLPreformatted"/>
+        <w:rPr>
+          <w:rStyle w:val="HTMLCode"/>
+        </w:rPr>
+      </w:pPr>
+      <w:r>
+        <w:rPr>
+          <w:rStyle w:val="HTMLCode"/>
+        </w:rPr>
+        <w:t xml:space="preserve">   ↓</w:t>
       </w:r>
     </w:p>
     <w:p>
-      <w:r>
-        <w:t>52. How to Decide Timeout in Hystrix/Resilience4j?</w:t>
+      <w:pPr>
+        <w:pStyle w:val="HTMLPreformatted"/>
+        <w:rPr>
+          <w:rStyle w:val="HTMLCode"/>
+        </w:rPr>
+      </w:pPr>
+      <w:r>
+        <w:rPr>
+          <w:rStyle w:val="HTMLCode"/>
+        </w:rPr>
+        <w:t>Eureka</w:t>
       </w:r>
     </w:p>
     <w:p>
-      <w:r>
-        <w:t>53. Where is payment-service?</w:t>
+      <w:pPr>
+        <w:pStyle w:val="HTMLPreformatted"/>
+        <w:rPr>
+          <w:rStyle w:val="HTMLCode"/>
+        </w:rPr>
+      </w:pPr>
+      <w:r>
+        <w:rPr>
+          <w:rStyle w:val="HTMLCode"/>
+        </w:rPr>
+        <w:t xml:space="preserve">   ↓</w:t>
       </w:r>
     </w:p>
     <w:p>
-      <w:r>
-        <w:t>54. Where is order-service?</w:t>
+      <w:pPr>
+        <w:pStyle w:val="HTMLPreformatted"/>
+        <w:rPr>
+          <w:rStyle w:val="HTMLCode"/>
+        </w:rPr>
+      </w:pPr>
+      <w:r>
+        <w:rPr>
+          <w:rStyle w:val="HTMLCode"/>
+        </w:rPr>
+        <w:t>Order Service</w:t>
       </w:r>
     </w:p>
     <w:p>
-      <w:r>
-        <w:t>55. How request first reaches API Gateway?</w:t>
+      <w:pPr>
+        <w:pStyle w:val="HTMLPreformatted"/>
+        <w:rPr>
+          <w:rStyle w:val="HTMLCode"/>
+        </w:rPr>
+      </w:pPr>
+      <w:r>
+        <w:rPr>
+          <w:rStyle w:val="HTMLCode"/>
+        </w:rPr>
+        <w:t xml:space="preserve">   ↓</w:t>
       </w:r>
     </w:p>
     <w:p>
-      <w:r>
-        <w:t>56. What Happens?</w:t>
+      <w:pPr>
+        <w:pStyle w:val="HTMLPreformatted"/>
+        <w:rPr>
+          <w:rStyle w:val="HTMLCode"/>
+        </w:rPr>
+      </w:pPr>
+      <w:r>
+        <w:rPr>
+          <w:rStyle w:val="HTMLCode"/>
+        </w:rPr>
+        <w:t>DispatcherServlet</w:t>
       </w:r>
     </w:p>
     <w:p>
-      <w:r>
-        <w:t>57. What is Sprint Planning? (In Short)</w:t>
+      <w:pPr>
+        <w:pStyle w:val="HTMLPreformatted"/>
+        <w:rPr>
+          <w:rStyle w:val="HTMLCode"/>
+        </w:rPr>
+      </w:pPr>
+      <w:r>
+        <w:rPr>
+          <w:rStyle w:val="HTMLCode"/>
+        </w:rPr>
+        <w:t xml:space="preserve">   ↓</w:t>
       </w:r>
     </w:p>
     <w:p>
-      <w:r>
-        <w:t>58. "Sprint planning answers: What are we building this sprint, and how will we build it?"</w:t>
+      <w:pPr>
+        <w:pStyle w:val="HTMLPreformatted"/>
+        <w:rPr>
+          <w:rStyle w:val="HTMLCode"/>
+        </w:rPr>
+      </w:pPr>
+      <w:r>
+        <w:rPr>
+          <w:rStyle w:val="HTMLCode"/>
+        </w:rPr>
+        <w:t>Controller</w:t>
       </w:r>
     </w:p>
     <w:p>
-      <w:r>
-        <w:t>59. What is Testing &amp; QA? (In Short)</w:t>
+      <w:pPr>
+        <w:pStyle w:val="HTMLPreformatted"/>
+        <w:rPr>
+          <w:rStyle w:val="HTMLCode"/>
+        </w:rPr>
+      </w:pPr>
+      <w:r>
+        <w:rPr>
+          <w:rStyle w:val="HTMLCode"/>
+        </w:rPr>
+        <w:t xml:space="preserve">   ↓</w:t>
       </w:r>
     </w:p>
     <w:p>
-      <w:r>
-        <w:t>60. What is Deployment? (In Short)</w:t>
+      <w:pPr>
+        <w:pStyle w:val="HTMLPreformatted"/>
+        <w:rPr>
+          <w:rStyle w:val="HTMLCode"/>
+        </w:rPr>
+      </w:pPr>
+      <w:r>
+        <w:rPr>
+          <w:rStyle w:val="HTMLCode"/>
+        </w:rPr>
+        <w:t>Feign Client</w:t>
       </w:r>
     </w:p>
     <w:p>
-      <w:r>
-        <w:t>61. What is Maintenance &amp; Support? (In Short)</w:t>
+      <w:pPr>
+        <w:pStyle w:val="HTMLPreformatted"/>
+        <w:rPr>
+          <w:rStyle w:val="HTMLCode"/>
+        </w:rPr>
+      </w:pPr>
+      <w:r>
+        <w:rPr>
+          <w:rStyle w:val="HTMLCode"/>
+        </w:rPr>
+        <w:t xml:space="preserve">   ↓</w:t>
       </w:r>
     </w:p>
     <w:p>
-      <w:r>
-        <w:t>62. how can you contribute to our organization?</w:t>
+      <w:pPr>
+        <w:pStyle w:val="HTMLPreformatted"/>
+        <w:rPr>
+          <w:rStyle w:val="HTMLCode"/>
+        </w:rPr>
+      </w:pPr>
+      <w:r>
+        <w:rPr>
+          <w:rStyle w:val="HTMLCode"/>
+        </w:rPr>
+        <w:t>Eureka</w:t>
       </w:r>
     </w:p>
     <w:p>
-      <w:r>
-        <w:t>63. What can we deliver?</w:t>
+      <w:pPr>
+        <w:pStyle w:val="HTMLPreformatted"/>
+        <w:rPr>
+          <w:rStyle w:val="HTMLCode"/>
+        </w:rPr>
+      </w:pPr>
+      <w:r>
+        <w:rPr>
+          <w:rStyle w:val="HTMLCode"/>
+        </w:rPr>
+        <w:t xml:space="preserve">   ↓</w:t>
       </w:r>
     </w:p>
     <w:p>
-      <w:r>
-        <w:t>64. How will we get it done?</w:t>
+      <w:pPr>
+        <w:pStyle w:val="HTMLPreformatted"/>
+      </w:pPr>
+      <w:r>
+        <w:rPr>
+          <w:rStyle w:val="HTMLCode"/>
+        </w:rPr>
+        <w:t>Payment Service</w:t>
       </w:r>
     </w:p>
     <w:p>
-      <w:r>
-        <w:t>65. What is our sprint goal?</w:t>
+      <w:pPr>
+        <w:pStyle w:val="NormalWeb"/>
+      </w:pPr>
+      <w:r>
+        <w:t xml:space="preserve">This complete flow is explicitly documented in the source. </w:t>
       </w:r>
     </w:p>
     <w:p>
       <w:r>
-        <w:t>66. Write a program for following: There is an array of integers, some duplicates, some unique. Insert these integers into another list of unique integers where they are sorted according to: 1. Number of times they are repeated in original array/list. 2. If two numbers are repeated same number of times, then sort by their insertion order.</w:t>
+        <w:pict>
+          <v:rect id="_x0000_i1029" style="width:0;height:1.5pt" o:hralign="center" o:hrstd="t" o:hr="t" fillcolor="#a0a0a0" stroked="f"/>
+        </w:pict>
       </w:r>
     </w:p>
     <w:p>
-      <w:r>
-        <w:t>67. Diagonal Population. You have 9 characters: ABCDEFGHI. Arrange them in a 2d array as shown:</w:t>
+      <w:pPr>
+        <w:pStyle w:val="Heading1"/>
+      </w:pPr>
+      <w:r>
+        <w:t>Question Set 6 — Saga &amp; Distributed Transactions</w:t>
       </w:r>
     </w:p>
     <w:p>
-      <w:r>
-        <w:t>68. Average Without Overflow. There are N integers. Each integer is large enough, that adding 2 or more integers in likely to cause bitwise overflow. Write a program to calculate the average of the N integers without causing overflow.</w:t>
+      <w:pPr>
+        <w:numPr>
+          <w:ilvl w:val="0"/>
+          <w:numId w:val="15"/>
+        </w:numPr>
+        <w:spacing w:before="100" w:beforeAutospacing="1" w:after="100" w:afterAutospacing="1" w:line="240" w:lineRule="auto"/>
+      </w:pPr>
+      <w:r>
+        <w:t xml:space="preserve">What is the </w:t>
+      </w:r>
+      <w:r>
+        <w:rPr>
+          <w:rStyle w:val="Strong"/>
+        </w:rPr>
+        <w:t>Saga Pattern</w:t>
+      </w:r>
+      <w:r>
+        <w:t xml:space="preserve">? </w:t>
       </w:r>
     </w:p>
     <w:p>
-      <w:r>
-        <w:t>69. Object Array to HashMap. Write a method / function that takes an Object array as argument and returns a HashMap. The elements of Object array are added in HashMap in following way: 1. Elements at even numbered position are keys 2. Elements at odd numbered position are values 3. If the array has odd number of elements, then the last value is null.</w:t>
+      <w:pPr>
+        <w:numPr>
+          <w:ilvl w:val="0"/>
+          <w:numId w:val="15"/>
+        </w:numPr>
+        <w:spacing w:before="100" w:beforeAutospacing="1" w:after="100" w:afterAutospacing="1" w:line="240" w:lineRule="auto"/>
+      </w:pPr>
+      <w:r>
+        <w:t xml:space="preserve">Why is Saga required in Microservices? </w:t>
       </w:r>
     </w:p>
     <w:p>
-      <w:r>
-        <w:t>70. Map&lt;square, root&gt; | Map of integral square to their integer roots. There is a set of integers whose square roots are also integers. Example: square root of 4 is 2, square root of 9 is 3 and so on. Create a map of all such integers as keys and their square roots as the value against those keys. That is: map.get(4) will return 2, map.get(9) will return 3, but map.get(5) will return null.</w:t>
+      <w:pPr>
+        <w:numPr>
+          <w:ilvl w:val="0"/>
+          <w:numId w:val="15"/>
+        </w:numPr>
+        <w:spacing w:before="100" w:beforeAutospacing="1" w:after="100" w:afterAutospacing="1" w:line="240" w:lineRule="auto"/>
+      </w:pPr>
+      <w:r>
+        <w:t xml:space="preserve">Why is distributed transaction difficult in Microservices? </w:t>
       </w:r>
     </w:p>
     <w:p>
-      <w:r>
-        <w:t>71. Interchange 2 sub-arrays within an array. There is an array: [A, B, C, D, U, V, W, X, Y, Z]. There are 2 sub-arrays in it (highlighted): [A, B, C, D, U, V, W, X, Y, Z]. Exchange the sub-arrays, i.e. the left sub-array becomes the right sub-array and the right sub-array becomes the left sub-array: [U, V, W, X, Y, Z, A, B, C, D]</w:t>
+      <w:pPr>
+        <w:numPr>
+          <w:ilvl w:val="0"/>
+          <w:numId w:val="15"/>
+        </w:numPr>
+        <w:spacing w:before="100" w:beforeAutospacing="1" w:after="100" w:afterAutospacing="1" w:line="240" w:lineRule="auto"/>
+      </w:pPr>
+      <w:r>
+        <w:t xml:space="preserve">What is a </w:t>
+      </w:r>
+      <w:r>
+        <w:rPr>
+          <w:rStyle w:val="Strong"/>
+        </w:rPr>
+        <w:t>Compensating Transaction</w:t>
+      </w:r>
+      <w:r>
+        <w:t xml:space="preserve">? </w:t>
       </w:r>
     </w:p>
     <w:p>
-      <w:r>
-        <w:t>72. Data Structure question: Create your Queue class that uses LinkedList to maintain the queue. The class Queue will have only 2 methods: enqueue and dequeue [or nq(object) and dq()]</w:t>
+      <w:pPr>
+        <w:numPr>
+          <w:ilvl w:val="0"/>
+          <w:numId w:val="15"/>
+        </w:numPr>
+        <w:spacing w:before="100" w:beforeAutospacing="1" w:after="100" w:afterAutospacing="1" w:line="240" w:lineRule="auto"/>
+      </w:pPr>
+      <w:r>
+        <w:t xml:space="preserve">Explain Saga with an Order → Payment → Inventory example. </w:t>
+      </w:r>
+    </w:p>
+    <w:p>
+      <w:pPr>
+        <w:numPr>
+          <w:ilvl w:val="0"/>
+          <w:numId w:val="15"/>
+        </w:numPr>
+        <w:spacing w:before="100" w:beforeAutospacing="1" w:after="100" w:afterAutospacing="1" w:line="240" w:lineRule="auto"/>
+      </w:pPr>
+      <w:r>
+        <w:t xml:space="preserve">What happens if Payment succeeds but Inventory fails? </w:t>
+      </w:r>
+    </w:p>
+    <w:p>
+      <w:pPr>
+        <w:numPr>
+          <w:ilvl w:val="0"/>
+          <w:numId w:val="15"/>
+        </w:numPr>
+        <w:spacing w:before="100" w:beforeAutospacing="1" w:after="100" w:afterAutospacing="1" w:line="240" w:lineRule="auto"/>
+      </w:pPr>
+      <w:r>
+        <w:t xml:space="preserve">How does Saga perform rollback? </w:t>
+      </w:r>
+    </w:p>
+    <w:p>
+      <w:pPr>
+        <w:numPr>
+          <w:ilvl w:val="0"/>
+          <w:numId w:val="15"/>
+        </w:numPr>
+        <w:spacing w:before="100" w:beforeAutospacing="1" w:after="100" w:afterAutospacing="1" w:line="240" w:lineRule="auto"/>
+      </w:pPr>
+      <w:r>
+        <w:t xml:space="preserve">What is </w:t>
+      </w:r>
+      <w:r>
+        <w:rPr>
+          <w:rStyle w:val="Strong"/>
+        </w:rPr>
+        <w:t>Saga Choreography</w:t>
+      </w:r>
+      <w:r>
+        <w:t xml:space="preserve">? </w:t>
+      </w:r>
+    </w:p>
+    <w:p>
+      <w:pPr>
+        <w:numPr>
+          <w:ilvl w:val="0"/>
+          <w:numId w:val="15"/>
+        </w:numPr>
+        <w:spacing w:before="100" w:beforeAutospacing="1" w:after="100" w:afterAutospacing="1" w:line="240" w:lineRule="auto"/>
+      </w:pPr>
+      <w:r>
+        <w:lastRenderedPageBreak/>
+        <w:t xml:space="preserve">How does Choreography Saga work? </w:t>
+      </w:r>
+    </w:p>
+    <w:p>
+      <w:pPr>
+        <w:numPr>
+          <w:ilvl w:val="0"/>
+          <w:numId w:val="15"/>
+        </w:numPr>
+        <w:spacing w:before="100" w:beforeAutospacing="1" w:after="100" w:afterAutospacing="1" w:line="240" w:lineRule="auto"/>
+      </w:pPr>
+      <w:r>
+        <w:t xml:space="preserve">What is </w:t>
+      </w:r>
+      <w:r>
+        <w:rPr>
+          <w:rStyle w:val="Strong"/>
+        </w:rPr>
+        <w:t>Saga Orchestration</w:t>
+      </w:r>
+      <w:r>
+        <w:t xml:space="preserve">? </w:t>
+      </w:r>
+    </w:p>
+    <w:p>
+      <w:pPr>
+        <w:numPr>
+          <w:ilvl w:val="0"/>
+          <w:numId w:val="15"/>
+        </w:numPr>
+        <w:spacing w:before="100" w:beforeAutospacing="1" w:after="100" w:afterAutospacing="1" w:line="240" w:lineRule="auto"/>
+      </w:pPr>
+      <w:r>
+        <w:t xml:space="preserve">How does Orchestration Saga work? </w:t>
+      </w:r>
+    </w:p>
+    <w:p>
+      <w:pPr>
+        <w:numPr>
+          <w:ilvl w:val="0"/>
+          <w:numId w:val="15"/>
+        </w:numPr>
+        <w:spacing w:before="100" w:beforeAutospacing="1" w:after="100" w:afterAutospacing="1" w:line="240" w:lineRule="auto"/>
+      </w:pPr>
+      <w:r>
+        <w:t xml:space="preserve">What is a </w:t>
+      </w:r>
+      <w:r>
+        <w:rPr>
+          <w:rStyle w:val="Strong"/>
+        </w:rPr>
+        <w:t>Saga Orchestrator</w:t>
+      </w:r>
+      <w:r>
+        <w:t xml:space="preserve">? </w:t>
+      </w:r>
+    </w:p>
+    <w:p>
+      <w:pPr>
+        <w:numPr>
+          <w:ilvl w:val="0"/>
+          <w:numId w:val="15"/>
+        </w:numPr>
+        <w:spacing w:before="100" w:beforeAutospacing="1" w:after="100" w:afterAutospacing="1" w:line="240" w:lineRule="auto"/>
+      </w:pPr>
+      <w:r>
+        <w:t xml:space="preserve">What is the difference between </w:t>
+      </w:r>
+      <w:r>
+        <w:rPr>
+          <w:rStyle w:val="Strong"/>
+        </w:rPr>
+        <w:t>Choreography and Orchestration</w:t>
+      </w:r>
+      <w:r>
+        <w:t xml:space="preserve">? </w:t>
+      </w:r>
+    </w:p>
+    <w:p>
+      <w:pPr>
+        <w:numPr>
+          <w:ilvl w:val="0"/>
+          <w:numId w:val="15"/>
+        </w:numPr>
+        <w:spacing w:before="100" w:beforeAutospacing="1" w:after="100" w:afterAutospacing="1" w:line="240" w:lineRule="auto"/>
+      </w:pPr>
+      <w:r>
+        <w:t xml:space="preserve">Which communication technologies can be used for Choreography? </w:t>
+      </w:r>
+    </w:p>
+    <w:p>
+      <w:pPr>
+        <w:numPr>
+          <w:ilvl w:val="0"/>
+          <w:numId w:val="15"/>
+        </w:numPr>
+        <w:spacing w:before="100" w:beforeAutospacing="1" w:after="100" w:afterAutospacing="1" w:line="240" w:lineRule="auto"/>
+      </w:pPr>
+      <w:r>
+        <w:t xml:space="preserve">How does Kafka/RabbitMQ participate in Saga? </w:t>
+      </w:r>
+    </w:p>
+    <w:p>
+      <w:pPr>
+        <w:pStyle w:val="NormalWeb"/>
+      </w:pPr>
+      <w:r>
+        <w:t xml:space="preserve">The source explicitly covers distributed transactions, compensating transactions, Choreography and Orchestration. </w:t>
+      </w:r>
+    </w:p>
+    <w:p>
+      <w:r>
+        <w:pict>
+          <v:rect id="_x0000_i1030" style="width:0;height:1.5pt" o:hralign="center" o:hrstd="t" o:hr="t" fillcolor="#a0a0a0" stroked="f"/>
+        </w:pict>
+      </w:r>
+    </w:p>
+    <w:p>
+      <w:pPr>
+        <w:pStyle w:val="Heading1"/>
+      </w:pPr>
+      <w:r>
+        <w:t>Question Set 7 — API Gateway Deep Dive</w:t>
+      </w:r>
+    </w:p>
+    <w:p>
+      <w:pPr>
+        <w:numPr>
+          <w:ilvl w:val="0"/>
+          <w:numId w:val="16"/>
+        </w:numPr>
+        <w:spacing w:before="100" w:beforeAutospacing="1" w:after="100" w:afterAutospacing="1" w:line="240" w:lineRule="auto"/>
+      </w:pPr>
+      <w:r>
+        <w:t xml:space="preserve">What is an </w:t>
+      </w:r>
+      <w:r>
+        <w:rPr>
+          <w:rStyle w:val="Strong"/>
+        </w:rPr>
+        <w:t>API Gateway</w:t>
+      </w:r>
+      <w:r>
+        <w:t xml:space="preserve">? </w:t>
+      </w:r>
+    </w:p>
+    <w:p>
+      <w:pPr>
+        <w:numPr>
+          <w:ilvl w:val="0"/>
+          <w:numId w:val="16"/>
+        </w:numPr>
+        <w:spacing w:before="100" w:beforeAutospacing="1" w:after="100" w:afterAutospacing="1" w:line="240" w:lineRule="auto"/>
+      </w:pPr>
+      <w:r>
+        <w:t xml:space="preserve">Why do we need API Gateway in Microservices? </w:t>
+      </w:r>
+    </w:p>
+    <w:p>
+      <w:pPr>
+        <w:numPr>
+          <w:ilvl w:val="0"/>
+          <w:numId w:val="16"/>
+        </w:numPr>
+        <w:spacing w:before="100" w:beforeAutospacing="1" w:after="100" w:afterAutospacing="1" w:line="240" w:lineRule="auto"/>
+      </w:pPr>
+      <w:r>
+        <w:t xml:space="preserve">How does API Gateway route requests? </w:t>
+      </w:r>
+    </w:p>
+    <w:p>
+      <w:pPr>
+        <w:numPr>
+          <w:ilvl w:val="0"/>
+          <w:numId w:val="16"/>
+        </w:numPr>
+        <w:spacing w:before="100" w:beforeAutospacing="1" w:after="100" w:afterAutospacing="1" w:line="240" w:lineRule="auto"/>
+      </w:pPr>
+      <w:r>
+        <w:t xml:space="preserve">How does API Gateway handle authentication? </w:t>
+      </w:r>
+    </w:p>
+    <w:p>
+      <w:pPr>
+        <w:numPr>
+          <w:ilvl w:val="0"/>
+          <w:numId w:val="16"/>
+        </w:numPr>
+        <w:spacing w:before="100" w:beforeAutospacing="1" w:after="100" w:afterAutospacing="1" w:line="240" w:lineRule="auto"/>
+      </w:pPr>
+      <w:r>
+        <w:t xml:space="preserve">How does API Gateway handle authorization? </w:t>
+      </w:r>
+    </w:p>
+    <w:p>
+      <w:pPr>
+        <w:numPr>
+          <w:ilvl w:val="0"/>
+          <w:numId w:val="16"/>
+        </w:numPr>
+        <w:spacing w:before="100" w:beforeAutospacing="1" w:after="100" w:afterAutospacing="1" w:line="240" w:lineRule="auto"/>
+      </w:pPr>
+      <w:r>
+        <w:t xml:space="preserve">How does API Gateway validate JWT? </w:t>
+      </w:r>
+    </w:p>
+    <w:p>
+      <w:pPr>
+        <w:numPr>
+          <w:ilvl w:val="0"/>
+          <w:numId w:val="16"/>
+        </w:numPr>
+        <w:spacing w:before="100" w:beforeAutospacing="1" w:after="100" w:afterAutospacing="1" w:line="240" w:lineRule="auto"/>
+      </w:pPr>
+      <w:r>
+        <w:t xml:space="preserve">How does API Gateway perform rate limiting? </w:t>
+      </w:r>
+    </w:p>
+    <w:p>
+      <w:pPr>
+        <w:numPr>
+          <w:ilvl w:val="0"/>
+          <w:numId w:val="16"/>
+        </w:numPr>
+        <w:spacing w:before="100" w:beforeAutospacing="1" w:after="100" w:afterAutospacing="1" w:line="240" w:lineRule="auto"/>
+      </w:pPr>
+      <w:r>
+        <w:t xml:space="preserve">How does API Gateway provide logging? </w:t>
+      </w:r>
+    </w:p>
+    <w:p>
+      <w:pPr>
+        <w:numPr>
+          <w:ilvl w:val="0"/>
+          <w:numId w:val="16"/>
+        </w:numPr>
+        <w:spacing w:before="100" w:beforeAutospacing="1" w:after="100" w:afterAutospacing="1" w:line="240" w:lineRule="auto"/>
+      </w:pPr>
+      <w:r>
+        <w:t xml:space="preserve">What is SSL termination at API Gateway? </w:t>
+      </w:r>
+    </w:p>
+    <w:p>
+      <w:pPr>
+        <w:numPr>
+          <w:ilvl w:val="0"/>
+          <w:numId w:val="16"/>
+        </w:numPr>
+        <w:spacing w:before="100" w:beforeAutospacing="1" w:after="100" w:afterAutospacing="1" w:line="240" w:lineRule="auto"/>
+      </w:pPr>
+      <w:r>
+        <w:t xml:space="preserve">What is the role of API Gateway as a reverse proxy? </w:t>
+      </w:r>
+    </w:p>
+    <w:p>
+      <w:pPr>
+        <w:numPr>
+          <w:ilvl w:val="0"/>
+          <w:numId w:val="16"/>
+        </w:numPr>
+        <w:spacing w:before="100" w:beforeAutospacing="1" w:after="100" w:afterAutospacing="1" w:line="240" w:lineRule="auto"/>
+      </w:pPr>
+      <w:r>
+        <w:t xml:space="preserve">How does API Gateway perform load balancing? </w:t>
+      </w:r>
+    </w:p>
+    <w:p>
+      <w:pPr>
+        <w:numPr>
+          <w:ilvl w:val="0"/>
+          <w:numId w:val="16"/>
+        </w:numPr>
+        <w:spacing w:before="100" w:beforeAutospacing="1" w:after="100" w:afterAutospacing="1" w:line="240" w:lineRule="auto"/>
+      </w:pPr>
+      <w:r>
+        <w:t xml:space="preserve">What happens when a service is unavailable? </w:t>
+      </w:r>
+    </w:p>
+    <w:p>
+      <w:pPr>
+        <w:numPr>
+          <w:ilvl w:val="0"/>
+          <w:numId w:val="16"/>
+        </w:numPr>
+        <w:spacing w:before="100" w:beforeAutospacing="1" w:after="100" w:afterAutospacing="1" w:line="240" w:lineRule="auto"/>
+      </w:pPr>
+      <w:r>
+        <w:t xml:space="preserve">What is </w:t>
+      </w:r>
+      <w:r>
+        <w:rPr>
+          <w:rStyle w:val="Strong"/>
+        </w:rPr>
+        <w:t>Spring Cloud Gateway</w:t>
+      </w:r>
+      <w:r>
+        <w:t xml:space="preserve">? </w:t>
+      </w:r>
+    </w:p>
+    <w:p>
+      <w:pPr>
+        <w:numPr>
+          <w:ilvl w:val="0"/>
+          <w:numId w:val="16"/>
+        </w:numPr>
+        <w:spacing w:before="100" w:beforeAutospacing="1" w:after="100" w:afterAutospacing="1" w:line="240" w:lineRule="auto"/>
+      </w:pPr>
+      <w:r>
+        <w:t xml:space="preserve">What is </w:t>
+      </w:r>
+      <w:r>
+        <w:rPr>
+          <w:rStyle w:val="Strong"/>
+        </w:rPr>
+        <w:t>Zuul</w:t>
+      </w:r>
+      <w:r>
+        <w:t xml:space="preserve">? </w:t>
+      </w:r>
+    </w:p>
+    <w:p>
+      <w:pPr>
+        <w:numPr>
+          <w:ilvl w:val="0"/>
+          <w:numId w:val="16"/>
+        </w:numPr>
+        <w:spacing w:before="100" w:beforeAutospacing="1" w:after="100" w:afterAutospacing="1" w:line="240" w:lineRule="auto"/>
+      </w:pPr>
+      <w:r>
+        <w:t xml:space="preserve">Spring Cloud Gateway vs Zuul. </w:t>
+      </w:r>
+    </w:p>
+    <w:p>
+      <w:pPr>
+        <w:numPr>
+          <w:ilvl w:val="0"/>
+          <w:numId w:val="16"/>
+        </w:numPr>
+        <w:spacing w:before="100" w:beforeAutospacing="1" w:after="100" w:afterAutospacing="1" w:line="240" w:lineRule="auto"/>
+      </w:pPr>
+      <w:r>
+        <w:t xml:space="preserve">Explain API Gateway request routing with an example. </w:t>
+      </w:r>
+    </w:p>
+    <w:p>
+      <w:pPr>
+        <w:numPr>
+          <w:ilvl w:val="0"/>
+          <w:numId w:val="16"/>
+        </w:numPr>
+        <w:spacing w:before="100" w:beforeAutospacing="1" w:after="100" w:afterAutospacing="1" w:line="240" w:lineRule="auto"/>
+      </w:pPr>
+      <w:r>
+        <w:t xml:space="preserve">How do you expose API Gateway publicly while keeping internal microservices private? </w:t>
+      </w:r>
+    </w:p>
+    <w:p>
+      <w:pPr>
+        <w:pStyle w:val="NormalWeb"/>
+      </w:pPr>
+      <w:r>
+        <w:t xml:space="preserve">The source covers routing, JWT/authentication, rate limiting, logging, SSL termination, reverse proxy and public exposure. </w:t>
+      </w:r>
+    </w:p>
+    <w:p>
+      <w:pPr>
+        <w:pStyle w:val="Heading1"/>
+      </w:pPr>
+      <w:bookmarkStart w:id="0" w:name="_GoBack"/>
+      <w:bookmarkEnd w:id="0"/>
+      <w:r>
+        <w:t xml:space="preserve">Original 29 </w:t>
+      </w:r>
+      <w:r>
+        <w:t>Questions — Exactly as Provided</w:t>
+      </w:r>
+    </w:p>
+    <w:p>
+      <w:r>
+        <w:t>1. What are the design patterns used in microservices?</w:t>
+      </w:r>
+    </w:p>
+    <w:p>
+      <w:r>
+        <w:t>2. What are the broad categories of design patterns used in microservices? and explain any 1 such category in detail.</w:t>
+      </w:r>
+    </w:p>
+    <w:p>
+      <w:r>
+        <w:t>3. How do you expose the API Gateway to other micro</w:t>
+      </w:r>
+      <w:r>
+        <w:t>services?</w:t>
+      </w:r>
+    </w:p>
+    <w:p>
+      <w:r>
+        <w:t>4. How do you maintain session between different services in microservices?</w:t>
+      </w:r>
+    </w:p>
+    <w:p>
+      <w:r>
+        <w:lastRenderedPageBreak/>
+        <w:t>5. What is the difference between JWT and OAuth/OAuth2?</w:t>
+      </w:r>
+    </w:p>
+    <w:p>
+      <w:r>
+        <w:t>6. How do you monitor whether a service is down in a microservice setup? Provide realistic answer will take answer</w:t>
+      </w:r>
+      <w:r>
+        <w:t xml:space="preserve"> from devops team</w:t>
+      </w:r>
+    </w:p>
+    <w:p>
+      <w:r>
+        <w:t>7. What is your strategy to solve this problem: one/some of the services are down in a microservice setup? Provide realistic answer will take answer from devops team</w:t>
+      </w:r>
+    </w:p>
+    <w:p>
+      <w:r>
+        <w:t>8. How do you define number-of-retires if a transaction fails in a serie</w:t>
+      </w:r>
+      <w:r>
+        <w:t>s of transactions?</w:t>
+      </w:r>
+    </w:p>
+    <w:p>
+      <w:r>
+        <w:t>9. What is a circuit breaker design pattern?</w:t>
+      </w:r>
+    </w:p>
+    <w:p>
+      <w:r>
+        <w:t>10. What is propagation in transactions?</w:t>
+      </w:r>
+    </w:p>
+    <w:p>
+      <w:r>
+        <w:t>11. What is the difference between builder pattern and factory pattern?</w:t>
+      </w:r>
+    </w:p>
+    <w:p>
+      <w:r>
+        <w:t xml:space="preserve">12. What things you need to take care if you are migrating a project from Java </w:t>
+      </w:r>
+      <w:r>
+        <w:t>6/7/8/9/11/16 to Java 17?</w:t>
+      </w:r>
+    </w:p>
+    <w:p>
+      <w:r>
+        <w:t>13. How will you consume a ReST based API request and produce a SOAP based API request in a message broker application?</w:t>
+      </w:r>
+    </w:p>
+    <w:p>
+      <w:r>
+        <w:t>14. How is session managed in ReST and SOAP based web services?</w:t>
+      </w:r>
+    </w:p>
+    <w:p>
+      <w:r>
+        <w:t xml:space="preserve">15. Can you use Hibernate without JPA? How do </w:t>
+      </w:r>
+      <w:r>
+        <w:t>you convert an application using only Hibernate to JPA compliant application?</w:t>
+      </w:r>
+    </w:p>
+    <w:p>
+      <w:r>
+        <w:t>16. Design an application stack where a mobile app and a web app share a common backend.</w:t>
+      </w:r>
+    </w:p>
+    <w:p>
+      <w:r>
+        <w:t>17. What architecture / architectures have you used in your last project?</w:t>
+      </w:r>
+    </w:p>
+    <w:p>
+      <w:r>
+        <w:t>18. What is the</w:t>
+      </w:r>
+      <w:r>
+        <w:t xml:space="preserve"> difference between relational and hierarchical databases?</w:t>
+      </w:r>
+    </w:p>
+    <w:p>
+      <w:r>
+        <w:t>19. When do you use relational or hierarchical or hybrid database?</w:t>
+      </w:r>
+    </w:p>
+    <w:p>
+      <w:r>
+        <w:t>20. On which principle do the HashMap work?</w:t>
+      </w:r>
+    </w:p>
+    <w:p>
+      <w:r>
+        <w:t>21. Why Map is not a Collection in Java?</w:t>
+      </w:r>
+    </w:p>
+    <w:p>
+      <w:r>
+        <w:t xml:space="preserve">22. What will be your program if you want to </w:t>
+      </w:r>
+      <w:r>
+        <w:t>insert millions of data in 1 million similar XML files into a database table?</w:t>
+      </w:r>
+    </w:p>
+    <w:p>
+      <w:r>
+        <w:t>23. What are the steps in migrating data from a DBMS from one vendor to another DBMS from another vendor? Eg. Migrating from SQL Server 2019 to Oracle 21c</w:t>
+      </w:r>
+    </w:p>
+    <w:p>
+      <w:r>
+        <w:t xml:space="preserve">24. How do you migrate </w:t>
+      </w:r>
+      <w:r>
+        <w:t>an application from ActiveMQ or RabbitMQ to Kafka?</w:t>
+      </w:r>
+    </w:p>
+    <w:p>
+      <w:r>
+        <w:t>25. How do you select suitable / apt architecture, frameworks, platforms, engines, libraries, etc for any application/applications?</w:t>
+      </w:r>
+    </w:p>
+    <w:p>
+      <w:r>
+        <w:lastRenderedPageBreak/>
+        <w:t>26. What is the last major problem that you have solved with any project?</w:t>
+      </w:r>
+    </w:p>
+    <w:p>
+      <w:r>
+        <w:t>27. How do you solve this problem: a team member induced a bug in a code, but he/she is not available to resolve that bug? Provide own live example</w:t>
+      </w:r>
+    </w:p>
+    <w:p>
+      <w:r>
+        <w:t>28. How do you resolve problems in live applications? Provide realistic answer will take answer from devops</w:t>
+      </w:r>
+      <w:r>
+        <w:t xml:space="preserve"> team</w:t>
+      </w:r>
+    </w:p>
+    <w:p>
+      <w:r>
+        <w:t>29. How do you optimize an existing application? Provide realistic answer will take answer from devops team</w:t>
+      </w:r>
+    </w:p>
+    <w:p>
+      <w:pPr>
+        <w:pStyle w:val="Heading1"/>
+      </w:pPr>
+      <w:r>
+        <w:t>Additional Unique Questions from Uploaded Files</w:t>
+      </w:r>
+    </w:p>
+    <w:p>
+      <w:r>
+        <w:t>1. What is the difference between DoP and SoD (delegation of power –vs– segregation of duties)</w:t>
+      </w:r>
+      <w:r>
+        <w:t>?</w:t>
+      </w:r>
+    </w:p>
+    <w:p>
+      <w:r>
+        <w:t>2. Which AI based code generator you prefer to use and why?</w:t>
+      </w:r>
+    </w:p>
+    <w:p>
+      <w:r>
+        <w:t>3. what are memory models in java?</w:t>
+      </w:r>
+    </w:p>
+    <w:p>
+      <w:r>
+        <w:t>4. how heap memory model works?</w:t>
+      </w:r>
+    </w:p>
+    <w:p>
+      <w:r>
+        <w:t>5. what are types of references in java?</w:t>
+      </w:r>
+    </w:p>
+    <w:p>
+      <w:r>
+        <w:t xml:space="preserve">6. counter question: why use weak-reference when garbage collection is a system heavy </w:t>
+      </w:r>
+      <w:r>
+        <w:t>process?</w:t>
+      </w:r>
+    </w:p>
+    <w:p>
+      <w:r>
+        <w:t>7. counter question: what problems have you faced with weak-references?</w:t>
+      </w:r>
+    </w:p>
+    <w:p>
+      <w:r>
+        <w:t>8. what are your views on string pool and immutability?</w:t>
+      </w:r>
+    </w:p>
+    <w:p>
+      <w:r>
+        <w:t>9. counter-question: why key in HashMap needs to be immutable, and specially in string?</w:t>
+      </w:r>
+    </w:p>
+    <w:p>
+      <w:r>
+        <w:t>10. how to deploy a web applica</w:t>
+      </w:r>
+      <w:r>
+        <w:t>tion in WebSphere?</w:t>
+      </w:r>
+    </w:p>
+    <w:p>
+      <w:r>
+        <w:t>11. what are the changes in spring boot application to deploy it in WebSphere?</w:t>
+      </w:r>
+    </w:p>
+    <w:p>
+      <w:r>
+        <w:t>12. what are the changes in spring servlet to deploy spring boot application in WebSphere?</w:t>
+      </w:r>
+    </w:p>
+    <w:p>
+      <w:r>
+        <w:t>13. what are the changes in JPA to deploy spring boot application i</w:t>
+      </w:r>
+      <w:r>
+        <w:t>n WebSphere?</w:t>
+      </w:r>
+    </w:p>
+    <w:p>
+      <w:r>
+        <w:t>14. how are exceptions handled in spring boot?</w:t>
+      </w:r>
+    </w:p>
+    <w:p>
+      <w:r>
+        <w:t>15. what is @ExceptionHandler annotation?</w:t>
+      </w:r>
+    </w:p>
+    <w:p>
+      <w:r>
+        <w:t>16. what is the difference between bean and component in spring?</w:t>
+      </w:r>
+    </w:p>
+    <w:p>
+      <w:r>
+        <w:t>17. which IDE have u used for spring + WebSphere development?</w:t>
+      </w:r>
+    </w:p>
+    <w:p>
+      <w:r>
+        <w:t xml:space="preserve">18. what is the strategy </w:t>
+      </w:r>
+      <w:r>
+        <w:t>you use to consume rest-based web services?</w:t>
+      </w:r>
+    </w:p>
+    <w:p>
+      <w:r>
+        <w:lastRenderedPageBreak/>
+        <w:t>19. counter question: what do you use in application - rest-template or feign-client and why?</w:t>
+      </w:r>
+    </w:p>
+    <w:p>
+      <w:r>
+        <w:t>20. what are the different types of AJAX calls in JavaScript?</w:t>
+      </w:r>
+    </w:p>
+    <w:p>
+      <w:r>
+        <w:t>21. what are http status codes 4xx and 5xx series?</w:t>
+      </w:r>
+    </w:p>
+    <w:p>
+      <w:r>
+        <w:t>22. h</w:t>
+      </w:r>
+      <w:r>
+        <w:t>ow will you authorize get request?</w:t>
+      </w:r>
+    </w:p>
+    <w:p>
+      <w:r>
+        <w:t>23. how will you use AES and RSA public key to secure login between client and server?</w:t>
+      </w:r>
+    </w:p>
+    <w:p>
+      <w:r>
+        <w:t>24. what is the cycle of payment in online payments?</w:t>
+      </w:r>
+    </w:p>
+    <w:p>
+      <w:r>
+        <w:t>25. in how many ways and how can you apply style in any tag in html?</w:t>
+      </w:r>
+    </w:p>
+    <w:p>
+      <w:r>
+        <w:t>26. how will</w:t>
+      </w:r>
+      <w:r>
+        <w:t xml:space="preserve"> you create a table in oracle and PostgreSQL? what are some differences?</w:t>
+      </w:r>
+    </w:p>
+    <w:p>
+      <w:r>
+        <w:t>27. what are the differences between select-with-join and views in PL/SQL?</w:t>
+      </w:r>
+    </w:p>
+    <w:p>
+      <w:r>
+        <w:t>28. what are the differences between procedures and functions in PL/SQL?</w:t>
+      </w:r>
+    </w:p>
+    <w:p>
+      <w:r>
+        <w:t>29. if you have to update many rows</w:t>
+      </w:r>
+      <w:r>
+        <w:t xml:space="preserve"> per second in tables in 2 different database servers A and B such that data in server A should be immediately updated in server B, how will you do it?</w:t>
+      </w:r>
+    </w:p>
+    <w:p>
+      <w:r>
+        <w:t>30. counter-question: what if you cannot write trigger in method 2?</w:t>
+      </w:r>
+    </w:p>
+    <w:p>
+      <w:r>
+        <w:t>31. what do you prefer for scheduled</w:t>
+      </w:r>
+      <w:r>
+        <w:t xml:space="preserve"> jobs to database table updates? spring scheduler or cron job or anything else?</w:t>
+      </w:r>
+    </w:p>
+    <w:p>
+      <w:r>
+        <w:t>32. what is the use of rate-limiting in the web servers?</w:t>
+      </w:r>
+    </w:p>
+    <w:p>
+      <w:r>
+        <w:t>33. how to fetch data in JSP from database without using java code at all? do you know how to use JSTL for this?</w:t>
+      </w:r>
+    </w:p>
+    <w:p>
+      <w:r>
+        <w:t>34. Ca</w:t>
+      </w:r>
+      <w:r>
+        <w:t>n you use Hibernate without JPA?</w:t>
+      </w:r>
+    </w:p>
+    <w:p>
+      <w:r>
+        <w:t>35. How do you convert an application using only Hibernate to JPA compliant application?</w:t>
+      </w:r>
+    </w:p>
+    <w:p>
+      <w:r>
+        <w:t>36. What happens in String.substring() method?</w:t>
+      </w:r>
+    </w:p>
+    <w:p>
+      <w:r>
+        <w:t>37. Why we use byte[] instead of String in cryptology classes and methods?</w:t>
+      </w:r>
+    </w:p>
+    <w:p>
+      <w:r>
+        <w:t>38. Why Java</w:t>
+      </w:r>
+      <w:r>
+        <w:t xml:space="preserve"> is not an object-oriented programming language?</w:t>
+      </w:r>
+    </w:p>
+    <w:p>
+      <w:r>
+        <w:t>39. What is Java?</w:t>
+      </w:r>
+    </w:p>
+    <w:p>
+      <w:r>
+        <w:t>40. Spring Boot / Spring Framework: What are the types of components in spring framework?</w:t>
+      </w:r>
+    </w:p>
+    <w:p>
+      <w:r>
+        <w:lastRenderedPageBreak/>
+        <w:t>41. How do you migrate a working monolithic project in Java 21(or any latest stable version) to a m</w:t>
+      </w:r>
+      <w:r>
+        <w:t>icroservice project?</w:t>
+      </w:r>
+    </w:p>
+    <w:p>
+      <w:r>
+        <w:t>42. What is a Service?</w:t>
+      </w:r>
+    </w:p>
+    <w:p>
+      <w:r>
+        <w:t>43. Do you plan to stay with this company very-long/forever?</w:t>
+      </w:r>
+    </w:p>
+    <w:p>
+      <w:r>
+        <w:t>44. “How do you maintain session in ReST?”; but ReST has no concept of session.</w:t>
+      </w:r>
+    </w:p>
+    <w:p>
+      <w:r>
+        <w:t xml:space="preserve">45. “How do you define retry-counts in Circuit-Breaker?”; but there is </w:t>
+      </w:r>
+      <w:r>
+        <w:t>no retry in Circuit-Breaker.</w:t>
+      </w:r>
+    </w:p>
+    <w:p>
+      <w:r>
+        <w:t>46. “If i delete from child table, then how will you manage the effect on the parent table?”; but deletion from child table has no effect on parent table.</w:t>
+      </w:r>
+    </w:p>
+    <w:p>
+      <w:r>
+        <w:t>47. 1MS=1DB OR 1MS=1schema OR N-MS=M-schemas OR All-MS=1DB?</w:t>
+      </w:r>
+    </w:p>
+    <w:p>
+      <w:r>
+        <w:t>48. How do y</w:t>
+      </w:r>
+      <w:r>
+        <w:t>ou create new database in Oracle Express?</w:t>
+      </w:r>
+    </w:p>
+    <w:p>
+      <w:r>
+        <w:t>49. How do you manage cookies/session in ReST?</w:t>
+      </w:r>
+    </w:p>
+    <w:p>
+      <w:r>
+        <w:t>50. How do you define retry-counts in Circuit-Breaker?</w:t>
+      </w:r>
+    </w:p>
+    <w:p>
+      <w:r>
+        <w:t>51. Why API Gateway Needed?</w:t>
+      </w:r>
+    </w:p>
+    <w:p>
+      <w:r>
+        <w:t>52. How to Decide Timeout in Hystrix/Resilience4j?</w:t>
+      </w:r>
+    </w:p>
+    <w:p>
+      <w:r>
+        <w:t>53. Where is payment-service?</w:t>
+      </w:r>
+    </w:p>
+    <w:p>
+      <w:r>
+        <w:t>54.</w:t>
+      </w:r>
+      <w:r>
+        <w:t xml:space="preserve"> Where is order-service?</w:t>
+      </w:r>
+    </w:p>
+    <w:p>
+      <w:r>
+        <w:t>55. How request first reaches API Gateway?</w:t>
+      </w:r>
+    </w:p>
+    <w:p>
+      <w:r>
+        <w:t>56. What Happens?</w:t>
+      </w:r>
+    </w:p>
+    <w:p>
+      <w:r>
+        <w:t>57. What is Sprint Planning? (In Short)</w:t>
+      </w:r>
+    </w:p>
+    <w:p>
+      <w:r>
+        <w:t>58. "Sprint planning answers: What are we building this sprint, and how will we build it?"</w:t>
+      </w:r>
+    </w:p>
+    <w:p>
+      <w:r>
+        <w:t>59. What is Testing &amp; QA? (In Short)</w:t>
+      </w:r>
+    </w:p>
+    <w:p>
+      <w:r>
+        <w:t>60. What is Deployment? (In Short)</w:t>
+      </w:r>
+    </w:p>
+    <w:p>
+      <w:r>
+        <w:t>61. What is Maintenance &amp; Support? (In Short)</w:t>
+      </w:r>
+    </w:p>
+    <w:p>
+      <w:r>
+        <w:t>62. how can you contribute to our organization?</w:t>
+      </w:r>
+    </w:p>
+    <w:p>
+      <w:r>
+        <w:t>63. What can we deliver?</w:t>
+      </w:r>
+    </w:p>
+    <w:p>
+      <w:r>
+        <w:t>64. How will we get it done?</w:t>
+      </w:r>
+    </w:p>
+    <w:p>
+      <w:r>
+        <w:lastRenderedPageBreak/>
+        <w:t>65. What is our sprint goal?</w:t>
+      </w:r>
+    </w:p>
+    <w:p>
+      <w:r>
+        <w:t xml:space="preserve">66. Write a program for following: There is </w:t>
+      </w:r>
+      <w:r>
+        <w:t>an array of integers, some duplicates, some unique. Insert these integers into another list of unique integers where they are sorted according to: 1. Number of times they are repeated in original array/list. 2. If two numbers are repeated same number of ti</w:t>
+      </w:r>
+      <w:r>
+        <w:t>mes, then sort by their insertion order.</w:t>
+      </w:r>
+    </w:p>
+    <w:p>
+      <w:r>
+        <w:t>67. Diagonal Population. You have 9 characters: ABCDEFGHI. Arrange them in a 2d array as shown:</w:t>
+      </w:r>
+    </w:p>
+    <w:p>
+      <w:r>
+        <w:t>68. Average Without Overflow. There are N integers. Each integer is large enough, that adding 2 or more integers in lik</w:t>
+      </w:r>
+      <w:r>
+        <w:t>ely to cause bitwise overflow. Write a program to calculate the average of the N integers without causing overflow.</w:t>
+      </w:r>
+    </w:p>
+    <w:p>
+      <w:r>
+        <w:t xml:space="preserve">69. Object Array to HashMap. Write a method / function that takes an Object array as argument and returns a HashMap. The elements of Object </w:t>
+      </w:r>
+      <w:r>
+        <w:t>array are added in HashMap in following way: 1. Elements at even numbered position are keys 2. Elements at odd numbered position are values 3. If the array has odd number of elements, then the last value is null.</w:t>
+      </w:r>
+    </w:p>
+    <w:p>
+      <w:r>
+        <w:t>70. Map&lt;square, root&gt; | Map of integral squ</w:t>
+      </w:r>
+      <w:r>
+        <w:t xml:space="preserve">are to their integer roots. There is a set of integers whose square roots are also integers. Example: square root of 4 is 2, square root of 9 is 3 and so on. Create a map of all such integers as keys and their square roots as the value against those keys. </w:t>
+      </w:r>
+      <w:r>
+        <w:t>That is: map.get(4) will return 2, map.get(9) will return 3, but map.get(5) will return null.</w:t>
+      </w:r>
+    </w:p>
+    <w:p>
+      <w:r>
+        <w:t>71. Interchange 2 sub-arrays within an array. There is an array: [A, B, C, D, U, V, W, X, Y, Z]. There are 2 sub-arrays in it (highlighted): [A, B, C, D, U, V, W,</w:t>
+      </w:r>
+      <w:r>
+        <w:t xml:space="preserve"> X, Y, Z]. Exchange the sub-arrays, i.e. the left sub-array becomes the right sub-array and the right sub-array becomes the left sub-array: [U, V, W, X, Y, Z, A, B, C, D]</w:t>
+      </w:r>
+    </w:p>
+    <w:p>
+      <w:r>
+        <w:t>72. Data Structure question: Create your Queue class that uses LinkedList to maintain</w:t>
+      </w:r>
+      <w:r>
+        <w:t xml:space="preserve"> the queue. The class Queue will have only 2 methods: enqueue and dequeue [or nq(object) and dq()]</w:t>
       </w:r>
     </w:p>
     <w:sectPr>
@@ -554,7 +2534,7 @@
 </file>
 
 <file path=word/numbering.xml><?xml version="1.0" encoding="utf-8"?>
-<w:numbering xmlns:wpc="http://schemas.microsoft.com/office/word/2010/wordprocessingCanvas" xmlns:mo="http://schemas.microsoft.com/office/mac/office/2008/main" xmlns:mc="http://schemas.openxmlformats.org/markup-compatibility/2006" xmlns:mv="urn:schemas-microsoft-com:mac:vml" xmlns:o="urn:schemas-microsoft-com:office:office" xmlns:r="http://schemas.openxmlformats.org/officeDocument/2006/relationships" xmlns:m="http://schemas.openxmlformats.org/officeDocument/2006/math" xmlns:v="urn:schemas-microsoft-com:vml" xmlns:wp14="http://schemas.microsoft.com/office/word/2010/wordprocessingDrawing" xmlns:wp="http://schemas.openxmlformats.org/drawingml/2006/wordprocessingDrawing" xmlns:w10="urn:schemas-microsoft-com:office:word" xmlns:w="http://schemas.openxmlformats.org/wordprocessingml/2006/main" xmlns:w14="http://schemas.microsoft.com/office/word/2010/wordml" xmlns:wpg="http://schemas.microsoft.com/office/word/2010/wordprocessingGroup" xmlns:wpi="http://schemas.microsoft.com/office/word/2010/wordprocessingInk" xmlns:wne="http://schemas.microsoft.com/office/word/2006/wordml" xmlns:wps="http://schemas.microsoft.com/office/word/2010/wordprocessingShape" mc:Ignorable="w14 wp14">
+<w:numbering xmlns:wpc="http://schemas.microsoft.com/office/word/2010/wordprocessingCanvas" xmlns:mc="http://schemas.openxmlformats.org/markup-compatibility/2006" xmlns:o="urn:schemas-microsoft-com:office:office" xmlns:r="http://schemas.openxmlformats.org/officeDocument/2006/relationships" xmlns:m="http://schemas.openxmlformats.org/officeDocument/2006/math" xmlns:v="urn:schemas-microsoft-com:vml" xmlns:wp14="http://schemas.microsoft.com/office/word/2010/wordprocessingDrawing" xmlns:wp="http://schemas.openxmlformats.org/drawingml/2006/wordprocessingDrawing" xmlns:w10="urn:schemas-microsoft-com:office:word" xmlns:w="http://schemas.openxmlformats.org/wordprocessingml/2006/main" xmlns:w14="http://schemas.microsoft.com/office/word/2010/wordml" xmlns:wpg="http://schemas.microsoft.com/office/word/2010/wordprocessingGroup" xmlns:wpi="http://schemas.microsoft.com/office/word/2010/wordprocessingInk" xmlns:wne="http://schemas.microsoft.com/office/word/2006/wordml" xmlns:wps="http://schemas.microsoft.com/office/word/2010/wordprocessingShape" mc:Ignorable="w14 wp14">
   <w:abstractNum w:abstractNumId="0">
     <w:nsid w:val="FFFFFF7C"/>
     <w:multiLevelType w:val="singleLevel"/>
@@ -724,6 +2704,797 @@
       <w:rPr>
         <w:rFonts w:ascii="Symbol" w:hAnsi="Symbol" w:hint="default"/>
       </w:rPr>
+    </w:lvl>
+  </w:abstractNum>
+  <w:abstractNum w:abstractNumId="9">
+    <w:nsid w:val="036D0FAB"/>
+    <w:multiLevelType w:val="multilevel"/>
+    <w:tmpl w:val="79A05DAA"/>
+    <w:lvl w:ilvl="0">
+      <w:start w:val="1"/>
+      <w:numFmt w:val="decimal"/>
+      <w:lvlText w:val="%1."/>
+      <w:lvlJc w:val="left"/>
+      <w:pPr>
+        <w:tabs>
+          <w:tab w:val="num" w:pos="720"/>
+        </w:tabs>
+        <w:ind w:left="720" w:hanging="360"/>
+      </w:pPr>
+    </w:lvl>
+    <w:lvl w:ilvl="1" w:tentative="1">
+      <w:start w:val="1"/>
+      <w:numFmt w:val="decimal"/>
+      <w:lvlText w:val="%2."/>
+      <w:lvlJc w:val="left"/>
+      <w:pPr>
+        <w:tabs>
+          <w:tab w:val="num" w:pos="1440"/>
+        </w:tabs>
+        <w:ind w:left="1440" w:hanging="360"/>
+      </w:pPr>
+    </w:lvl>
+    <w:lvl w:ilvl="2" w:tentative="1">
+      <w:start w:val="1"/>
+      <w:numFmt w:val="decimal"/>
+      <w:lvlText w:val="%3."/>
+      <w:lvlJc w:val="left"/>
+      <w:pPr>
+        <w:tabs>
+          <w:tab w:val="num" w:pos="2160"/>
+        </w:tabs>
+        <w:ind w:left="2160" w:hanging="360"/>
+      </w:pPr>
+    </w:lvl>
+    <w:lvl w:ilvl="3" w:tentative="1">
+      <w:start w:val="1"/>
+      <w:numFmt w:val="decimal"/>
+      <w:lvlText w:val="%4."/>
+      <w:lvlJc w:val="left"/>
+      <w:pPr>
+        <w:tabs>
+          <w:tab w:val="num" w:pos="2880"/>
+        </w:tabs>
+        <w:ind w:left="2880" w:hanging="360"/>
+      </w:pPr>
+    </w:lvl>
+    <w:lvl w:ilvl="4" w:tentative="1">
+      <w:start w:val="1"/>
+      <w:numFmt w:val="decimal"/>
+      <w:lvlText w:val="%5."/>
+      <w:lvlJc w:val="left"/>
+      <w:pPr>
+        <w:tabs>
+          <w:tab w:val="num" w:pos="3600"/>
+        </w:tabs>
+        <w:ind w:left="3600" w:hanging="360"/>
+      </w:pPr>
+    </w:lvl>
+    <w:lvl w:ilvl="5" w:tentative="1">
+      <w:start w:val="1"/>
+      <w:numFmt w:val="decimal"/>
+      <w:lvlText w:val="%6."/>
+      <w:lvlJc w:val="left"/>
+      <w:pPr>
+        <w:tabs>
+          <w:tab w:val="num" w:pos="4320"/>
+        </w:tabs>
+        <w:ind w:left="4320" w:hanging="360"/>
+      </w:pPr>
+    </w:lvl>
+    <w:lvl w:ilvl="6" w:tentative="1">
+      <w:start w:val="1"/>
+      <w:numFmt w:val="decimal"/>
+      <w:lvlText w:val="%7."/>
+      <w:lvlJc w:val="left"/>
+      <w:pPr>
+        <w:tabs>
+          <w:tab w:val="num" w:pos="5040"/>
+        </w:tabs>
+        <w:ind w:left="5040" w:hanging="360"/>
+      </w:pPr>
+    </w:lvl>
+    <w:lvl w:ilvl="7" w:tentative="1">
+      <w:start w:val="1"/>
+      <w:numFmt w:val="decimal"/>
+      <w:lvlText w:val="%8."/>
+      <w:lvlJc w:val="left"/>
+      <w:pPr>
+        <w:tabs>
+          <w:tab w:val="num" w:pos="5760"/>
+        </w:tabs>
+        <w:ind w:left="5760" w:hanging="360"/>
+      </w:pPr>
+    </w:lvl>
+    <w:lvl w:ilvl="8" w:tentative="1">
+      <w:start w:val="1"/>
+      <w:numFmt w:val="decimal"/>
+      <w:lvlText w:val="%9."/>
+      <w:lvlJc w:val="left"/>
+      <w:pPr>
+        <w:tabs>
+          <w:tab w:val="num" w:pos="6480"/>
+        </w:tabs>
+        <w:ind w:left="6480" w:hanging="360"/>
+      </w:pPr>
+    </w:lvl>
+  </w:abstractNum>
+  <w:abstractNum w:abstractNumId="10">
+    <w:nsid w:val="1F13614E"/>
+    <w:multiLevelType w:val="multilevel"/>
+    <w:tmpl w:val="588EB956"/>
+    <w:lvl w:ilvl="0">
+      <w:start w:val="1"/>
+      <w:numFmt w:val="decimal"/>
+      <w:lvlText w:val="%1."/>
+      <w:lvlJc w:val="left"/>
+      <w:pPr>
+        <w:tabs>
+          <w:tab w:val="num" w:pos="720"/>
+        </w:tabs>
+        <w:ind w:left="720" w:hanging="360"/>
+      </w:pPr>
+    </w:lvl>
+    <w:lvl w:ilvl="1" w:tentative="1">
+      <w:start w:val="1"/>
+      <w:numFmt w:val="decimal"/>
+      <w:lvlText w:val="%2."/>
+      <w:lvlJc w:val="left"/>
+      <w:pPr>
+        <w:tabs>
+          <w:tab w:val="num" w:pos="1440"/>
+        </w:tabs>
+        <w:ind w:left="1440" w:hanging="360"/>
+      </w:pPr>
+    </w:lvl>
+    <w:lvl w:ilvl="2" w:tentative="1">
+      <w:start w:val="1"/>
+      <w:numFmt w:val="decimal"/>
+      <w:lvlText w:val="%3."/>
+      <w:lvlJc w:val="left"/>
+      <w:pPr>
+        <w:tabs>
+          <w:tab w:val="num" w:pos="2160"/>
+        </w:tabs>
+        <w:ind w:left="2160" w:hanging="360"/>
+      </w:pPr>
+    </w:lvl>
+    <w:lvl w:ilvl="3" w:tentative="1">
+      <w:start w:val="1"/>
+      <w:numFmt w:val="decimal"/>
+      <w:lvlText w:val="%4."/>
+      <w:lvlJc w:val="left"/>
+      <w:pPr>
+        <w:tabs>
+          <w:tab w:val="num" w:pos="2880"/>
+        </w:tabs>
+        <w:ind w:left="2880" w:hanging="360"/>
+      </w:pPr>
+    </w:lvl>
+    <w:lvl w:ilvl="4" w:tentative="1">
+      <w:start w:val="1"/>
+      <w:numFmt w:val="decimal"/>
+      <w:lvlText w:val="%5."/>
+      <w:lvlJc w:val="left"/>
+      <w:pPr>
+        <w:tabs>
+          <w:tab w:val="num" w:pos="3600"/>
+        </w:tabs>
+        <w:ind w:left="3600" w:hanging="360"/>
+      </w:pPr>
+    </w:lvl>
+    <w:lvl w:ilvl="5" w:tentative="1">
+      <w:start w:val="1"/>
+      <w:numFmt w:val="decimal"/>
+      <w:lvlText w:val="%6."/>
+      <w:lvlJc w:val="left"/>
+      <w:pPr>
+        <w:tabs>
+          <w:tab w:val="num" w:pos="4320"/>
+        </w:tabs>
+        <w:ind w:left="4320" w:hanging="360"/>
+      </w:pPr>
+    </w:lvl>
+    <w:lvl w:ilvl="6" w:tentative="1">
+      <w:start w:val="1"/>
+      <w:numFmt w:val="decimal"/>
+      <w:lvlText w:val="%7."/>
+      <w:lvlJc w:val="left"/>
+      <w:pPr>
+        <w:tabs>
+          <w:tab w:val="num" w:pos="5040"/>
+        </w:tabs>
+        <w:ind w:left="5040" w:hanging="360"/>
+      </w:pPr>
+    </w:lvl>
+    <w:lvl w:ilvl="7" w:tentative="1">
+      <w:start w:val="1"/>
+      <w:numFmt w:val="decimal"/>
+      <w:lvlText w:val="%8."/>
+      <w:lvlJc w:val="left"/>
+      <w:pPr>
+        <w:tabs>
+          <w:tab w:val="num" w:pos="5760"/>
+        </w:tabs>
+        <w:ind w:left="5760" w:hanging="360"/>
+      </w:pPr>
+    </w:lvl>
+    <w:lvl w:ilvl="8" w:tentative="1">
+      <w:start w:val="1"/>
+      <w:numFmt w:val="decimal"/>
+      <w:lvlText w:val="%9."/>
+      <w:lvlJc w:val="left"/>
+      <w:pPr>
+        <w:tabs>
+          <w:tab w:val="num" w:pos="6480"/>
+        </w:tabs>
+        <w:ind w:left="6480" w:hanging="360"/>
+      </w:pPr>
+    </w:lvl>
+  </w:abstractNum>
+  <w:abstractNum w:abstractNumId="11">
+    <w:nsid w:val="332F56B0"/>
+    <w:multiLevelType w:val="multilevel"/>
+    <w:tmpl w:val="C2DCE78C"/>
+    <w:lvl w:ilvl="0">
+      <w:start w:val="1"/>
+      <w:numFmt w:val="decimal"/>
+      <w:lvlText w:val="%1."/>
+      <w:lvlJc w:val="left"/>
+      <w:pPr>
+        <w:tabs>
+          <w:tab w:val="num" w:pos="720"/>
+        </w:tabs>
+        <w:ind w:left="720" w:hanging="360"/>
+      </w:pPr>
+    </w:lvl>
+    <w:lvl w:ilvl="1" w:tentative="1">
+      <w:start w:val="1"/>
+      <w:numFmt w:val="decimal"/>
+      <w:lvlText w:val="%2."/>
+      <w:lvlJc w:val="left"/>
+      <w:pPr>
+        <w:tabs>
+          <w:tab w:val="num" w:pos="1440"/>
+        </w:tabs>
+        <w:ind w:left="1440" w:hanging="360"/>
+      </w:pPr>
+    </w:lvl>
+    <w:lvl w:ilvl="2" w:tentative="1">
+      <w:start w:val="1"/>
+      <w:numFmt w:val="decimal"/>
+      <w:lvlText w:val="%3."/>
+      <w:lvlJc w:val="left"/>
+      <w:pPr>
+        <w:tabs>
+          <w:tab w:val="num" w:pos="2160"/>
+        </w:tabs>
+        <w:ind w:left="2160" w:hanging="360"/>
+      </w:pPr>
+    </w:lvl>
+    <w:lvl w:ilvl="3" w:tentative="1">
+      <w:start w:val="1"/>
+      <w:numFmt w:val="decimal"/>
+      <w:lvlText w:val="%4."/>
+      <w:lvlJc w:val="left"/>
+      <w:pPr>
+        <w:tabs>
+          <w:tab w:val="num" w:pos="2880"/>
+        </w:tabs>
+        <w:ind w:left="2880" w:hanging="360"/>
+      </w:pPr>
+    </w:lvl>
+    <w:lvl w:ilvl="4" w:tentative="1">
+      <w:start w:val="1"/>
+      <w:numFmt w:val="decimal"/>
+      <w:lvlText w:val="%5."/>
+      <w:lvlJc w:val="left"/>
+      <w:pPr>
+        <w:tabs>
+          <w:tab w:val="num" w:pos="3600"/>
+        </w:tabs>
+        <w:ind w:left="3600" w:hanging="360"/>
+      </w:pPr>
+    </w:lvl>
+    <w:lvl w:ilvl="5" w:tentative="1">
+      <w:start w:val="1"/>
+      <w:numFmt w:val="decimal"/>
+      <w:lvlText w:val="%6."/>
+      <w:lvlJc w:val="left"/>
+      <w:pPr>
+        <w:tabs>
+          <w:tab w:val="num" w:pos="4320"/>
+        </w:tabs>
+        <w:ind w:left="4320" w:hanging="360"/>
+      </w:pPr>
+    </w:lvl>
+    <w:lvl w:ilvl="6" w:tentative="1">
+      <w:start w:val="1"/>
+      <w:numFmt w:val="decimal"/>
+      <w:lvlText w:val="%7."/>
+      <w:lvlJc w:val="left"/>
+      <w:pPr>
+        <w:tabs>
+          <w:tab w:val="num" w:pos="5040"/>
+        </w:tabs>
+        <w:ind w:left="5040" w:hanging="360"/>
+      </w:pPr>
+    </w:lvl>
+    <w:lvl w:ilvl="7" w:tentative="1">
+      <w:start w:val="1"/>
+      <w:numFmt w:val="decimal"/>
+      <w:lvlText w:val="%8."/>
+      <w:lvlJc w:val="left"/>
+      <w:pPr>
+        <w:tabs>
+          <w:tab w:val="num" w:pos="5760"/>
+        </w:tabs>
+        <w:ind w:left="5760" w:hanging="360"/>
+      </w:pPr>
+    </w:lvl>
+    <w:lvl w:ilvl="8" w:tentative="1">
+      <w:start w:val="1"/>
+      <w:numFmt w:val="decimal"/>
+      <w:lvlText w:val="%9."/>
+      <w:lvlJc w:val="left"/>
+      <w:pPr>
+        <w:tabs>
+          <w:tab w:val="num" w:pos="6480"/>
+        </w:tabs>
+        <w:ind w:left="6480" w:hanging="360"/>
+      </w:pPr>
+    </w:lvl>
+  </w:abstractNum>
+  <w:abstractNum w:abstractNumId="12">
+    <w:nsid w:val="410E007A"/>
+    <w:multiLevelType w:val="multilevel"/>
+    <w:tmpl w:val="EAA43C4C"/>
+    <w:lvl w:ilvl="0">
+      <w:start w:val="1"/>
+      <w:numFmt w:val="decimal"/>
+      <w:lvlText w:val="%1."/>
+      <w:lvlJc w:val="left"/>
+      <w:pPr>
+        <w:tabs>
+          <w:tab w:val="num" w:pos="720"/>
+        </w:tabs>
+        <w:ind w:left="720" w:hanging="360"/>
+      </w:pPr>
+    </w:lvl>
+    <w:lvl w:ilvl="1" w:tentative="1">
+      <w:start w:val="1"/>
+      <w:numFmt w:val="decimal"/>
+      <w:lvlText w:val="%2."/>
+      <w:lvlJc w:val="left"/>
+      <w:pPr>
+        <w:tabs>
+          <w:tab w:val="num" w:pos="1440"/>
+        </w:tabs>
+        <w:ind w:left="1440" w:hanging="360"/>
+      </w:pPr>
+    </w:lvl>
+    <w:lvl w:ilvl="2" w:tentative="1">
+      <w:start w:val="1"/>
+      <w:numFmt w:val="decimal"/>
+      <w:lvlText w:val="%3."/>
+      <w:lvlJc w:val="left"/>
+      <w:pPr>
+        <w:tabs>
+          <w:tab w:val="num" w:pos="2160"/>
+        </w:tabs>
+        <w:ind w:left="2160" w:hanging="360"/>
+      </w:pPr>
+    </w:lvl>
+    <w:lvl w:ilvl="3" w:tentative="1">
+      <w:start w:val="1"/>
+      <w:numFmt w:val="decimal"/>
+      <w:lvlText w:val="%4."/>
+      <w:lvlJc w:val="left"/>
+      <w:pPr>
+        <w:tabs>
+          <w:tab w:val="num" w:pos="2880"/>
+        </w:tabs>
+        <w:ind w:left="2880" w:hanging="360"/>
+      </w:pPr>
+    </w:lvl>
+    <w:lvl w:ilvl="4" w:tentative="1">
+      <w:start w:val="1"/>
+      <w:numFmt w:val="decimal"/>
+      <w:lvlText w:val="%5."/>
+      <w:lvlJc w:val="left"/>
+      <w:pPr>
+        <w:tabs>
+          <w:tab w:val="num" w:pos="3600"/>
+        </w:tabs>
+        <w:ind w:left="3600" w:hanging="360"/>
+      </w:pPr>
+    </w:lvl>
+    <w:lvl w:ilvl="5" w:tentative="1">
+      <w:start w:val="1"/>
+      <w:numFmt w:val="decimal"/>
+      <w:lvlText w:val="%6."/>
+      <w:lvlJc w:val="left"/>
+      <w:pPr>
+        <w:tabs>
+          <w:tab w:val="num" w:pos="4320"/>
+        </w:tabs>
+        <w:ind w:left="4320" w:hanging="360"/>
+      </w:pPr>
+    </w:lvl>
+    <w:lvl w:ilvl="6" w:tentative="1">
+      <w:start w:val="1"/>
+      <w:numFmt w:val="decimal"/>
+      <w:lvlText w:val="%7."/>
+      <w:lvlJc w:val="left"/>
+      <w:pPr>
+        <w:tabs>
+          <w:tab w:val="num" w:pos="5040"/>
+        </w:tabs>
+        <w:ind w:left="5040" w:hanging="360"/>
+      </w:pPr>
+    </w:lvl>
+    <w:lvl w:ilvl="7" w:tentative="1">
+      <w:start w:val="1"/>
+      <w:numFmt w:val="decimal"/>
+      <w:lvlText w:val="%8."/>
+      <w:lvlJc w:val="left"/>
+      <w:pPr>
+        <w:tabs>
+          <w:tab w:val="num" w:pos="5760"/>
+        </w:tabs>
+        <w:ind w:left="5760" w:hanging="360"/>
+      </w:pPr>
+    </w:lvl>
+    <w:lvl w:ilvl="8" w:tentative="1">
+      <w:start w:val="1"/>
+      <w:numFmt w:val="decimal"/>
+      <w:lvlText w:val="%9."/>
+      <w:lvlJc w:val="left"/>
+      <w:pPr>
+        <w:tabs>
+          <w:tab w:val="num" w:pos="6480"/>
+        </w:tabs>
+        <w:ind w:left="6480" w:hanging="360"/>
+      </w:pPr>
+    </w:lvl>
+  </w:abstractNum>
+  <w:abstractNum w:abstractNumId="13">
+    <w:nsid w:val="41760C99"/>
+    <w:multiLevelType w:val="multilevel"/>
+    <w:tmpl w:val="189ECB98"/>
+    <w:lvl w:ilvl="0">
+      <w:start w:val="1"/>
+      <w:numFmt w:val="decimal"/>
+      <w:lvlText w:val="%1."/>
+      <w:lvlJc w:val="left"/>
+      <w:pPr>
+        <w:tabs>
+          <w:tab w:val="num" w:pos="720"/>
+        </w:tabs>
+        <w:ind w:left="720" w:hanging="360"/>
+      </w:pPr>
+    </w:lvl>
+    <w:lvl w:ilvl="1" w:tentative="1">
+      <w:start w:val="1"/>
+      <w:numFmt w:val="decimal"/>
+      <w:lvlText w:val="%2."/>
+      <w:lvlJc w:val="left"/>
+      <w:pPr>
+        <w:tabs>
+          <w:tab w:val="num" w:pos="1440"/>
+        </w:tabs>
+        <w:ind w:left="1440" w:hanging="360"/>
+      </w:pPr>
+    </w:lvl>
+    <w:lvl w:ilvl="2" w:tentative="1">
+      <w:start w:val="1"/>
+      <w:numFmt w:val="decimal"/>
+      <w:lvlText w:val="%3."/>
+      <w:lvlJc w:val="left"/>
+      <w:pPr>
+        <w:tabs>
+          <w:tab w:val="num" w:pos="2160"/>
+        </w:tabs>
+        <w:ind w:left="2160" w:hanging="360"/>
+      </w:pPr>
+    </w:lvl>
+    <w:lvl w:ilvl="3" w:tentative="1">
+      <w:start w:val="1"/>
+      <w:numFmt w:val="decimal"/>
+      <w:lvlText w:val="%4."/>
+      <w:lvlJc w:val="left"/>
+      <w:pPr>
+        <w:tabs>
+          <w:tab w:val="num" w:pos="2880"/>
+        </w:tabs>
+        <w:ind w:left="2880" w:hanging="360"/>
+      </w:pPr>
+    </w:lvl>
+    <w:lvl w:ilvl="4" w:tentative="1">
+      <w:start w:val="1"/>
+      <w:numFmt w:val="decimal"/>
+      <w:lvlText w:val="%5."/>
+      <w:lvlJc w:val="left"/>
+      <w:pPr>
+        <w:tabs>
+          <w:tab w:val="num" w:pos="3600"/>
+        </w:tabs>
+        <w:ind w:left="3600" w:hanging="360"/>
+      </w:pPr>
+    </w:lvl>
+    <w:lvl w:ilvl="5" w:tentative="1">
+      <w:start w:val="1"/>
+      <w:numFmt w:val="decimal"/>
+      <w:lvlText w:val="%6."/>
+      <w:lvlJc w:val="left"/>
+      <w:pPr>
+        <w:tabs>
+          <w:tab w:val="num" w:pos="4320"/>
+        </w:tabs>
+        <w:ind w:left="4320" w:hanging="360"/>
+      </w:pPr>
+    </w:lvl>
+    <w:lvl w:ilvl="6" w:tentative="1">
+      <w:start w:val="1"/>
+      <w:numFmt w:val="decimal"/>
+      <w:lvlText w:val="%7."/>
+      <w:lvlJc w:val="left"/>
+      <w:pPr>
+        <w:tabs>
+          <w:tab w:val="num" w:pos="5040"/>
+        </w:tabs>
+        <w:ind w:left="5040" w:hanging="360"/>
+      </w:pPr>
+    </w:lvl>
+    <w:lvl w:ilvl="7" w:tentative="1">
+      <w:start w:val="1"/>
+      <w:numFmt w:val="decimal"/>
+      <w:lvlText w:val="%8."/>
+      <w:lvlJc w:val="left"/>
+      <w:pPr>
+        <w:tabs>
+          <w:tab w:val="num" w:pos="5760"/>
+        </w:tabs>
+        <w:ind w:left="5760" w:hanging="360"/>
+      </w:pPr>
+    </w:lvl>
+    <w:lvl w:ilvl="8" w:tentative="1">
+      <w:start w:val="1"/>
+      <w:numFmt w:val="decimal"/>
+      <w:lvlText w:val="%9."/>
+      <w:lvlJc w:val="left"/>
+      <w:pPr>
+        <w:tabs>
+          <w:tab w:val="num" w:pos="6480"/>
+        </w:tabs>
+        <w:ind w:left="6480" w:hanging="360"/>
+      </w:pPr>
+    </w:lvl>
+  </w:abstractNum>
+  <w:abstractNum w:abstractNumId="14">
+    <w:nsid w:val="4F5A704A"/>
+    <w:multiLevelType w:val="multilevel"/>
+    <w:tmpl w:val="0854DD68"/>
+    <w:lvl w:ilvl="0">
+      <w:start w:val="1"/>
+      <w:numFmt w:val="decimal"/>
+      <w:lvlText w:val="%1."/>
+      <w:lvlJc w:val="left"/>
+      <w:pPr>
+        <w:tabs>
+          <w:tab w:val="num" w:pos="720"/>
+        </w:tabs>
+        <w:ind w:left="720" w:hanging="360"/>
+      </w:pPr>
+    </w:lvl>
+    <w:lvl w:ilvl="1" w:tentative="1">
+      <w:start w:val="1"/>
+      <w:numFmt w:val="decimal"/>
+      <w:lvlText w:val="%2."/>
+      <w:lvlJc w:val="left"/>
+      <w:pPr>
+        <w:tabs>
+          <w:tab w:val="num" w:pos="1440"/>
+        </w:tabs>
+        <w:ind w:left="1440" w:hanging="360"/>
+      </w:pPr>
+    </w:lvl>
+    <w:lvl w:ilvl="2" w:tentative="1">
+      <w:start w:val="1"/>
+      <w:numFmt w:val="decimal"/>
+      <w:lvlText w:val="%3."/>
+      <w:lvlJc w:val="left"/>
+      <w:pPr>
+        <w:tabs>
+          <w:tab w:val="num" w:pos="2160"/>
+        </w:tabs>
+        <w:ind w:left="2160" w:hanging="360"/>
+      </w:pPr>
+    </w:lvl>
+    <w:lvl w:ilvl="3" w:tentative="1">
+      <w:start w:val="1"/>
+      <w:numFmt w:val="decimal"/>
+      <w:lvlText w:val="%4."/>
+      <w:lvlJc w:val="left"/>
+      <w:pPr>
+        <w:tabs>
+          <w:tab w:val="num" w:pos="2880"/>
+        </w:tabs>
+        <w:ind w:left="2880" w:hanging="360"/>
+      </w:pPr>
+    </w:lvl>
+    <w:lvl w:ilvl="4" w:tentative="1">
+      <w:start w:val="1"/>
+      <w:numFmt w:val="decimal"/>
+      <w:lvlText w:val="%5."/>
+      <w:lvlJc w:val="left"/>
+      <w:pPr>
+        <w:tabs>
+          <w:tab w:val="num" w:pos="3600"/>
+        </w:tabs>
+        <w:ind w:left="3600" w:hanging="360"/>
+      </w:pPr>
+    </w:lvl>
+    <w:lvl w:ilvl="5" w:tentative="1">
+      <w:start w:val="1"/>
+      <w:numFmt w:val="decimal"/>
+      <w:lvlText w:val="%6."/>
+      <w:lvlJc w:val="left"/>
+      <w:pPr>
+        <w:tabs>
+          <w:tab w:val="num" w:pos="4320"/>
+        </w:tabs>
+        <w:ind w:left="4320" w:hanging="360"/>
+      </w:pPr>
+    </w:lvl>
+    <w:lvl w:ilvl="6" w:tentative="1">
+      <w:start w:val="1"/>
+      <w:numFmt w:val="decimal"/>
+      <w:lvlText w:val="%7."/>
+      <w:lvlJc w:val="left"/>
+      <w:pPr>
+        <w:tabs>
+          <w:tab w:val="num" w:pos="5040"/>
+        </w:tabs>
+        <w:ind w:left="5040" w:hanging="360"/>
+      </w:pPr>
+    </w:lvl>
+    <w:lvl w:ilvl="7" w:tentative="1">
+      <w:start w:val="1"/>
+      <w:numFmt w:val="decimal"/>
+      <w:lvlText w:val="%8."/>
+      <w:lvlJc w:val="left"/>
+      <w:pPr>
+        <w:tabs>
+          <w:tab w:val="num" w:pos="5760"/>
+        </w:tabs>
+        <w:ind w:left="5760" w:hanging="360"/>
+      </w:pPr>
+    </w:lvl>
+    <w:lvl w:ilvl="8" w:tentative="1">
+      <w:start w:val="1"/>
+      <w:numFmt w:val="decimal"/>
+      <w:lvlText w:val="%9."/>
+      <w:lvlJc w:val="left"/>
+      <w:pPr>
+        <w:tabs>
+          <w:tab w:val="num" w:pos="6480"/>
+        </w:tabs>
+        <w:ind w:left="6480" w:hanging="360"/>
+      </w:pPr>
+    </w:lvl>
+  </w:abstractNum>
+  <w:abstractNum w:abstractNumId="15">
+    <w:nsid w:val="4FDA1B0B"/>
+    <w:multiLevelType w:val="multilevel"/>
+    <w:tmpl w:val="6F081446"/>
+    <w:lvl w:ilvl="0">
+      <w:start w:val="1"/>
+      <w:numFmt w:val="decimal"/>
+      <w:lvlText w:val="%1."/>
+      <w:lvlJc w:val="left"/>
+      <w:pPr>
+        <w:tabs>
+          <w:tab w:val="num" w:pos="720"/>
+        </w:tabs>
+        <w:ind w:left="720" w:hanging="360"/>
+      </w:pPr>
+    </w:lvl>
+    <w:lvl w:ilvl="1" w:tentative="1">
+      <w:start w:val="1"/>
+      <w:numFmt w:val="decimal"/>
+      <w:lvlText w:val="%2."/>
+      <w:lvlJc w:val="left"/>
+      <w:pPr>
+        <w:tabs>
+          <w:tab w:val="num" w:pos="1440"/>
+        </w:tabs>
+        <w:ind w:left="1440" w:hanging="360"/>
+      </w:pPr>
+    </w:lvl>
+    <w:lvl w:ilvl="2" w:tentative="1">
+      <w:start w:val="1"/>
+      <w:numFmt w:val="decimal"/>
+      <w:lvlText w:val="%3."/>
+      <w:lvlJc w:val="left"/>
+      <w:pPr>
+        <w:tabs>
+          <w:tab w:val="num" w:pos="2160"/>
+        </w:tabs>
+        <w:ind w:left="2160" w:hanging="360"/>
+      </w:pPr>
+    </w:lvl>
+    <w:lvl w:ilvl="3" w:tentative="1">
+      <w:start w:val="1"/>
+      <w:numFmt w:val="decimal"/>
+      <w:lvlText w:val="%4."/>
+      <w:lvlJc w:val="left"/>
+      <w:pPr>
+        <w:tabs>
+          <w:tab w:val="num" w:pos="2880"/>
+        </w:tabs>
+        <w:ind w:left="2880" w:hanging="360"/>
+      </w:pPr>
+    </w:lvl>
+    <w:lvl w:ilvl="4" w:tentative="1">
+      <w:start w:val="1"/>
+      <w:numFmt w:val="decimal"/>
+      <w:lvlText w:val="%5."/>
+      <w:lvlJc w:val="left"/>
+      <w:pPr>
+        <w:tabs>
+          <w:tab w:val="num" w:pos="3600"/>
+        </w:tabs>
+        <w:ind w:left="3600" w:hanging="360"/>
+      </w:pPr>
+    </w:lvl>
+    <w:lvl w:ilvl="5" w:tentative="1">
+      <w:start w:val="1"/>
+      <w:numFmt w:val="decimal"/>
+      <w:lvlText w:val="%6."/>
+      <w:lvlJc w:val="left"/>
+      <w:pPr>
+        <w:tabs>
+          <w:tab w:val="num" w:pos="4320"/>
+        </w:tabs>
+        <w:ind w:left="4320" w:hanging="360"/>
+      </w:pPr>
+    </w:lvl>
+    <w:lvl w:ilvl="6" w:tentative="1">
+      <w:start w:val="1"/>
+      <w:numFmt w:val="decimal"/>
+      <w:lvlText w:val="%7."/>
+      <w:lvlJc w:val="left"/>
+      <w:pPr>
+        <w:tabs>
+          <w:tab w:val="num" w:pos="5040"/>
+        </w:tabs>
+        <w:ind w:left="5040" w:hanging="360"/>
+      </w:pPr>
+    </w:lvl>
+    <w:lvl w:ilvl="7" w:tentative="1">
+      <w:start w:val="1"/>
+      <w:numFmt w:val="decimal"/>
+      <w:lvlText w:val="%8."/>
+      <w:lvlJc w:val="left"/>
+      <w:pPr>
+        <w:tabs>
+          <w:tab w:val="num" w:pos="5760"/>
+        </w:tabs>
+        <w:ind w:left="5760" w:hanging="360"/>
+      </w:pPr>
+    </w:lvl>
+    <w:lvl w:ilvl="8" w:tentative="1">
+      <w:start w:val="1"/>
+      <w:numFmt w:val="decimal"/>
+      <w:lvlText w:val="%9."/>
+      <w:lvlJc w:val="left"/>
+      <w:pPr>
+        <w:tabs>
+          <w:tab w:val="num" w:pos="6480"/>
+        </w:tabs>
+        <w:ind w:left="6480" w:hanging="360"/>
+      </w:pPr>
     </w:lvl>
   </w:abstractNum>
   <w:num w:numId="1">
@@ -753,6 +3524,27 @@
   <w:num w:numId="9">
     <w:abstractNumId w:val="0"/>
   </w:num>
+  <w:num w:numId="10">
+    <w:abstractNumId w:val="11"/>
+  </w:num>
+  <w:num w:numId="11">
+    <w:abstractNumId w:val="14"/>
+  </w:num>
+  <w:num w:numId="12">
+    <w:abstractNumId w:val="12"/>
+  </w:num>
+  <w:num w:numId="13">
+    <w:abstractNumId w:val="15"/>
+  </w:num>
+  <w:num w:numId="14">
+    <w:abstractNumId w:val="10"/>
+  </w:num>
+  <w:num w:numId="15">
+    <w:abstractNumId w:val="13"/>
+  </w:num>
+  <w:num w:numId="16">
+    <w:abstractNumId w:val="9"/>
+  </w:num>
 </w:numbering>
 </file>
 
@@ -773,7 +3565,7 @@
       </w:pPr>
     </w:pPrDefault>
   </w:docDefaults>
-  <w:latentStyles w:defLockedState="0" w:defUIPriority="99" w:defSemiHidden="1" w:defUnhideWhenUsed="1" w:defQFormat="0" w:count="276">
+  <w:latentStyles w:defLockedState="0" w:defUIPriority="99" w:defSemiHidden="1" w:defUnhideWhenUsed="1" w:defQFormat="0" w:count="267">
     <w:lsdException w:name="Normal" w:semiHidden="0" w:uiPriority="0" w:unhideWhenUsed="0" w:qFormat="1"/>
     <w:lsdException w:name="heading 1" w:semiHidden="0" w:uiPriority="9" w:unhideWhenUsed="0" w:qFormat="1"/>
     <w:lsdException w:name="heading 2" w:uiPriority="9" w:qFormat="1"/>
@@ -917,50 +3709,6 @@
     <w:qFormat/>
     <w:rsid w:val="00FC693F"/>
   </w:style>
-  <w:style w:type="paragraph" w:styleId="Header">
-    <w:name w:val="header"/>
-    <w:basedOn w:val="Normal"/>
-    <w:link w:val="HeaderChar"/>
-    <w:uiPriority w:val="99"/>
-    <w:unhideWhenUsed/>
-    <w:rsid w:val="00E618BF"/>
-    <w:pPr>
-      <w:tabs>
-        <w:tab w:val="center" w:pos="4680"/>
-        <w:tab w:val="right" w:pos="9360"/>
-      </w:tabs>
-      <w:spacing w:after="0" w:line="240" w:lineRule="auto"/>
-    </w:pPr>
-  </w:style>
-  <w:style w:type="character" w:customStyle="1" w:styleId="HeaderChar">
-    <w:name w:val="Header Char"/>
-    <w:basedOn w:val="DefaultParagraphFont"/>
-    <w:link w:val="Header"/>
-    <w:uiPriority w:val="99"/>
-    <w:rsid w:val="00E618BF"/>
-  </w:style>
-  <w:style w:type="paragraph" w:styleId="Footer">
-    <w:name w:val="footer"/>
-    <w:basedOn w:val="Normal"/>
-    <w:link w:val="FooterChar"/>
-    <w:uiPriority w:val="99"/>
-    <w:unhideWhenUsed/>
-    <w:rsid w:val="00E618BF"/>
-    <w:pPr>
-      <w:tabs>
-        <w:tab w:val="center" w:pos="4680"/>
-        <w:tab w:val="right" w:pos="9360"/>
-      </w:tabs>
-      <w:spacing w:after="0" w:line="240" w:lineRule="auto"/>
-    </w:pPr>
-  </w:style>
-  <w:style w:type="character" w:customStyle="1" w:styleId="FooterChar">
-    <w:name w:val="Footer Char"/>
-    <w:basedOn w:val="DefaultParagraphFont"/>
-    <w:link w:val="Footer"/>
-    <w:uiPriority w:val="99"/>
-    <w:rsid w:val="00E618BF"/>
-  </w:style>
   <w:style w:type="paragraph" w:styleId="Heading1">
     <w:name w:val="heading 1"/>
     <w:basedOn w:val="Normal"/>
@@ -1196,6 +3944,50 @@
     <w:uiPriority w:val="99"/>
     <w:semiHidden/>
     <w:unhideWhenUsed/>
+  </w:style>
+  <w:style w:type="paragraph" w:styleId="Header">
+    <w:name w:val="header"/>
+    <w:basedOn w:val="Normal"/>
+    <w:link w:val="HeaderChar"/>
+    <w:uiPriority w:val="99"/>
+    <w:unhideWhenUsed/>
+    <w:rsid w:val="00E618BF"/>
+    <w:pPr>
+      <w:tabs>
+        <w:tab w:val="center" w:pos="4680"/>
+        <w:tab w:val="right" w:pos="9360"/>
+      </w:tabs>
+      <w:spacing w:after="0" w:line="240" w:lineRule="auto"/>
+    </w:pPr>
+  </w:style>
+  <w:style w:type="character" w:customStyle="1" w:styleId="HeaderChar">
+    <w:name w:val="Header Char"/>
+    <w:basedOn w:val="DefaultParagraphFont"/>
+    <w:link w:val="Header"/>
+    <w:uiPriority w:val="99"/>
+    <w:rsid w:val="00E618BF"/>
+  </w:style>
+  <w:style w:type="paragraph" w:styleId="Footer">
+    <w:name w:val="footer"/>
+    <w:basedOn w:val="Normal"/>
+    <w:link w:val="FooterChar"/>
+    <w:uiPriority w:val="99"/>
+    <w:unhideWhenUsed/>
+    <w:rsid w:val="00E618BF"/>
+    <w:pPr>
+      <w:tabs>
+        <w:tab w:val="center" w:pos="4680"/>
+        <w:tab w:val="right" w:pos="9360"/>
+      </w:tabs>
+      <w:spacing w:after="0" w:line="240" w:lineRule="auto"/>
+    </w:pPr>
+  </w:style>
+  <w:style w:type="character" w:customStyle="1" w:styleId="FooterChar">
+    <w:name w:val="Footer Char"/>
+    <w:basedOn w:val="DefaultParagraphFont"/>
+    <w:link w:val="Footer"/>
+    <w:uiPriority w:val="99"/>
+    <w:rsid w:val="00E618BF"/>
   </w:style>
   <w:style w:type="paragraph" w:styleId="NoSpacing">
     <w:name w:val="No Spacing"/>
@@ -12599,11 +15391,91 @@
       </w:tcPr>
     </w:tblStylePr>
   </w:style>
+  <w:style w:type="paragraph" w:styleId="NormalWeb">
+    <w:name w:val="Normal (Web)"/>
+    <w:basedOn w:val="Normal"/>
+    <w:uiPriority w:val="99"/>
+    <w:semiHidden/>
+    <w:unhideWhenUsed/>
+    <w:rsid w:val="003F372F"/>
+    <w:pPr>
+      <w:spacing w:before="100" w:beforeAutospacing="1" w:after="100" w:afterAutospacing="1" w:line="240" w:lineRule="auto"/>
+    </w:pPr>
+    <w:rPr>
+      <w:rFonts w:ascii="Times New Roman" w:eastAsia="Times New Roman" w:hAnsi="Times New Roman" w:cs="Times New Roman"/>
+      <w:sz w:val="24"/>
+      <w:szCs w:val="24"/>
+      <w:lang w:val="en-IN" w:eastAsia="en-IN"/>
+    </w:rPr>
+  </w:style>
+  <w:style w:type="paragraph" w:styleId="HTMLPreformatted">
+    <w:name w:val="HTML Preformatted"/>
+    <w:basedOn w:val="Normal"/>
+    <w:link w:val="HTMLPreformattedChar"/>
+    <w:uiPriority w:val="99"/>
+    <w:semiHidden/>
+    <w:unhideWhenUsed/>
+    <w:rsid w:val="003F372F"/>
+    <w:pPr>
+      <w:tabs>
+        <w:tab w:val="left" w:pos="916"/>
+        <w:tab w:val="left" w:pos="1832"/>
+        <w:tab w:val="left" w:pos="2748"/>
+        <w:tab w:val="left" w:pos="3664"/>
+        <w:tab w:val="left" w:pos="4580"/>
+        <w:tab w:val="left" w:pos="5496"/>
+        <w:tab w:val="left" w:pos="6412"/>
+        <w:tab w:val="left" w:pos="7328"/>
+        <w:tab w:val="left" w:pos="8244"/>
+        <w:tab w:val="left" w:pos="9160"/>
+        <w:tab w:val="left" w:pos="10076"/>
+        <w:tab w:val="left" w:pos="10992"/>
+        <w:tab w:val="left" w:pos="11908"/>
+        <w:tab w:val="left" w:pos="12824"/>
+        <w:tab w:val="left" w:pos="13740"/>
+        <w:tab w:val="left" w:pos="14656"/>
+      </w:tabs>
+      <w:spacing w:after="0" w:line="240" w:lineRule="auto"/>
+    </w:pPr>
+    <w:rPr>
+      <w:rFonts w:ascii="Courier New" w:eastAsia="Times New Roman" w:hAnsi="Courier New" w:cs="Courier New"/>
+      <w:sz w:val="20"/>
+      <w:szCs w:val="20"/>
+      <w:lang w:val="en-IN" w:eastAsia="en-IN"/>
+    </w:rPr>
+  </w:style>
+  <w:style w:type="character" w:customStyle="1" w:styleId="HTMLPreformattedChar">
+    <w:name w:val="HTML Preformatted Char"/>
+    <w:basedOn w:val="DefaultParagraphFont"/>
+    <w:link w:val="HTMLPreformatted"/>
+    <w:uiPriority w:val="99"/>
+    <w:semiHidden/>
+    <w:rsid w:val="003F372F"/>
+    <w:rPr>
+      <w:rFonts w:ascii="Courier New" w:eastAsia="Times New Roman" w:hAnsi="Courier New" w:cs="Courier New"/>
+      <w:sz w:val="20"/>
+      <w:szCs w:val="20"/>
+      <w:lang w:val="en-IN" w:eastAsia="en-IN"/>
+    </w:rPr>
+  </w:style>
+  <w:style w:type="character" w:styleId="HTMLCode">
+    <w:name w:val="HTML Code"/>
+    <w:basedOn w:val="DefaultParagraphFont"/>
+    <w:uiPriority w:val="99"/>
+    <w:semiHidden/>
+    <w:unhideWhenUsed/>
+    <w:rsid w:val="003F372F"/>
+    <w:rPr>
+      <w:rFonts w:ascii="Courier New" w:eastAsia="Times New Roman" w:hAnsi="Courier New" w:cs="Courier New"/>
+      <w:sz w:val="20"/>
+      <w:szCs w:val="20"/>
+    </w:rPr>
+  </w:style>
 </w:styles>
 </file>
 
 <file path=word/stylesWithEffects.xml><?xml version="1.0" encoding="utf-8"?>
-<w:styles xmlns:wpc="http://schemas.microsoft.com/office/word/2010/wordprocessingCanvas" xmlns:mo="http://schemas.microsoft.com/office/mac/office/2008/main" xmlns:mc="http://schemas.openxmlformats.org/markup-compatibility/2006" xmlns:mv="urn:schemas-microsoft-com:mac:vml" xmlns:o="urn:schemas-microsoft-com:office:office" xmlns:r="http://schemas.openxmlformats.org/officeDocument/2006/relationships" xmlns:m="http://schemas.openxmlformats.org/officeDocument/2006/math" xmlns:v="urn:schemas-microsoft-com:vml" xmlns:wp14="http://schemas.microsoft.com/office/word/2010/wordprocessingDrawing" xmlns:wp="http://schemas.openxmlformats.org/drawingml/2006/wordprocessingDrawing" xmlns:w10="urn:schemas-microsoft-com:office:word" xmlns:w="http://schemas.openxmlformats.org/wordprocessingml/2006/main" xmlns:w14="http://schemas.microsoft.com/office/word/2010/wordml" xmlns:wpg="http://schemas.microsoft.com/office/word/2010/wordprocessingGroup" xmlns:wpi="http://schemas.microsoft.com/office/word/2010/wordprocessingInk" xmlns:wne="http://schemas.microsoft.com/office/word/2006/wordml" xmlns:wps="http://schemas.microsoft.com/office/word/2010/wordprocessingShape" mc:Ignorable="w14 wp14">
+<w:styles xmlns:wpc="http://schemas.microsoft.com/office/word/2010/wordprocessingCanvas" xmlns:mc="http://schemas.openxmlformats.org/markup-compatibility/2006" xmlns:o="urn:schemas-microsoft-com:office:office" xmlns:r="http://schemas.openxmlformats.org/officeDocument/2006/relationships" xmlns:m="http://schemas.openxmlformats.org/officeDocument/2006/math" xmlns:v="urn:schemas-microsoft-com:vml" xmlns:wp14="http://schemas.microsoft.com/office/word/2010/wordprocessingDrawing" xmlns:wp="http://schemas.openxmlformats.org/drawingml/2006/wordprocessingDrawing" xmlns:w10="urn:schemas-microsoft-com:office:word" xmlns:w="http://schemas.openxmlformats.org/wordprocessingml/2006/main" xmlns:w14="http://schemas.microsoft.com/office/word/2010/wordml" xmlns:wpg="http://schemas.microsoft.com/office/word/2010/wordprocessingGroup" xmlns:wpi="http://schemas.microsoft.com/office/word/2010/wordprocessingInk" xmlns:wne="http://schemas.microsoft.com/office/word/2006/wordml" xmlns:wps="http://schemas.microsoft.com/office/word/2010/wordprocessingShape" mc:Ignorable="w14 wp14">
   <w:docDefaults>
     <w:rPrDefault>
       <w:rPr>
@@ -12619,7 +15491,7 @@
       </w:pPr>
     </w:pPrDefault>
   </w:docDefaults>
-  <w:latentStyles w:defLockedState="0" w:defUIPriority="99" w:defSemiHidden="1" w:defUnhideWhenUsed="1" w:defQFormat="0" w:count="276">
+  <w:latentStyles w:defLockedState="0" w:defUIPriority="99" w:defSemiHidden="1" w:defUnhideWhenUsed="1" w:defQFormat="0" w:count="267">
     <w:lsdException w:name="Normal" w:semiHidden="0" w:uiPriority="0" w:unhideWhenUsed="0" w:qFormat="1"/>
     <w:lsdException w:name="heading 1" w:semiHidden="0" w:uiPriority="9" w:unhideWhenUsed="0" w:qFormat="1"/>
     <w:lsdException w:name="heading 2" w:uiPriority="9" w:qFormat="1"/>
@@ -12999,6 +15871,50 @@
     <w:semiHidden/>
     <w:unhideWhenUsed/>
   </w:style>
+  <w:style w:type="paragraph" w:styleId="Header">
+    <w:name w:val="header"/>
+    <w:basedOn w:val="Normal"/>
+    <w:link w:val="HeaderChar"/>
+    <w:uiPriority w:val="99"/>
+    <w:unhideWhenUsed/>
+    <w:rsid w:val="00E618BF"/>
+    <w:pPr>
+      <w:tabs>
+        <w:tab w:val="center" w:pos="4680"/>
+        <w:tab w:val="right" w:pos="9360"/>
+      </w:tabs>
+      <w:spacing w:after="0" w:line="240" w:lineRule="auto"/>
+    </w:pPr>
+  </w:style>
+  <w:style w:type="character" w:customStyle="1" w:styleId="HeaderChar">
+    <w:name w:val="Header Char"/>
+    <w:basedOn w:val="DefaultParagraphFont"/>
+    <w:link w:val="Header"/>
+    <w:uiPriority w:val="99"/>
+    <w:rsid w:val="00E618BF"/>
+  </w:style>
+  <w:style w:type="paragraph" w:styleId="Footer">
+    <w:name w:val="footer"/>
+    <w:basedOn w:val="Normal"/>
+    <w:link w:val="FooterChar"/>
+    <w:uiPriority w:val="99"/>
+    <w:unhideWhenUsed/>
+    <w:rsid w:val="00E618BF"/>
+    <w:pPr>
+      <w:tabs>
+        <w:tab w:val="center" w:pos="4680"/>
+        <w:tab w:val="right" w:pos="9360"/>
+      </w:tabs>
+      <w:spacing w:after="0" w:line="240" w:lineRule="auto"/>
+    </w:pPr>
+  </w:style>
+  <w:style w:type="character" w:customStyle="1" w:styleId="FooterChar">
+    <w:name w:val="Footer Char"/>
+    <w:basedOn w:val="DefaultParagraphFont"/>
+    <w:link w:val="Footer"/>
+    <w:uiPriority w:val="99"/>
+    <w:rsid w:val="00E618BF"/>
+  </w:style>
   <w:style w:type="paragraph" w:styleId="NoSpacing">
     <w:name w:val="No Spacing"/>
     <w:uiPriority w:val="1"/>
@@ -24400,6 +27316,86 @@
         <w:shd w:val="clear" w:color="auto" w:fill="FBCAA2" w:themeFill="accent6" w:themeFillTint="7F"/>
       </w:tcPr>
     </w:tblStylePr>
+  </w:style>
+  <w:style w:type="paragraph" w:styleId="NormalWeb">
+    <w:name w:val="Normal (Web)"/>
+    <w:basedOn w:val="Normal"/>
+    <w:uiPriority w:val="99"/>
+    <w:semiHidden/>
+    <w:unhideWhenUsed/>
+    <w:rsid w:val="003F372F"/>
+    <w:pPr>
+      <w:spacing w:before="100" w:beforeAutospacing="1" w:after="100" w:afterAutospacing="1" w:line="240" w:lineRule="auto"/>
+    </w:pPr>
+    <w:rPr>
+      <w:rFonts w:ascii="Times New Roman" w:eastAsia="Times New Roman" w:hAnsi="Times New Roman" w:cs="Times New Roman"/>
+      <w:sz w:val="24"/>
+      <w:szCs w:val="24"/>
+      <w:lang w:val="en-IN" w:eastAsia="en-IN"/>
+    </w:rPr>
+  </w:style>
+  <w:style w:type="paragraph" w:styleId="HTMLPreformatted">
+    <w:name w:val="HTML Preformatted"/>
+    <w:basedOn w:val="Normal"/>
+    <w:link w:val="HTMLPreformattedChar"/>
+    <w:uiPriority w:val="99"/>
+    <w:semiHidden/>
+    <w:unhideWhenUsed/>
+    <w:rsid w:val="003F372F"/>
+    <w:pPr>
+      <w:tabs>
+        <w:tab w:val="left" w:pos="916"/>
+        <w:tab w:val="left" w:pos="1832"/>
+        <w:tab w:val="left" w:pos="2748"/>
+        <w:tab w:val="left" w:pos="3664"/>
+        <w:tab w:val="left" w:pos="4580"/>
+        <w:tab w:val="left" w:pos="5496"/>
+        <w:tab w:val="left" w:pos="6412"/>
+        <w:tab w:val="left" w:pos="7328"/>
+        <w:tab w:val="left" w:pos="8244"/>
+        <w:tab w:val="left" w:pos="9160"/>
+        <w:tab w:val="left" w:pos="10076"/>
+        <w:tab w:val="left" w:pos="10992"/>
+        <w:tab w:val="left" w:pos="11908"/>
+        <w:tab w:val="left" w:pos="12824"/>
+        <w:tab w:val="left" w:pos="13740"/>
+        <w:tab w:val="left" w:pos="14656"/>
+      </w:tabs>
+      <w:spacing w:after="0" w:line="240" w:lineRule="auto"/>
+    </w:pPr>
+    <w:rPr>
+      <w:rFonts w:ascii="Courier New" w:eastAsia="Times New Roman" w:hAnsi="Courier New" w:cs="Courier New"/>
+      <w:sz w:val="20"/>
+      <w:szCs w:val="20"/>
+      <w:lang w:val="en-IN" w:eastAsia="en-IN"/>
+    </w:rPr>
+  </w:style>
+  <w:style w:type="character" w:customStyle="1" w:styleId="HTMLPreformattedChar">
+    <w:name w:val="HTML Preformatted Char"/>
+    <w:basedOn w:val="DefaultParagraphFont"/>
+    <w:link w:val="HTMLPreformatted"/>
+    <w:uiPriority w:val="99"/>
+    <w:semiHidden/>
+    <w:rsid w:val="003F372F"/>
+    <w:rPr>
+      <w:rFonts w:ascii="Courier New" w:eastAsia="Times New Roman" w:hAnsi="Courier New" w:cs="Courier New"/>
+      <w:sz w:val="20"/>
+      <w:szCs w:val="20"/>
+      <w:lang w:val="en-IN" w:eastAsia="en-IN"/>
+    </w:rPr>
+  </w:style>
+  <w:style w:type="character" w:styleId="HTMLCode">
+    <w:name w:val="HTML Code"/>
+    <w:basedOn w:val="DefaultParagraphFont"/>
+    <w:uiPriority w:val="99"/>
+    <w:semiHidden/>
+    <w:unhideWhenUsed/>
+    <w:rsid w:val="003F372F"/>
+    <w:rPr>
+      <w:rFonts w:ascii="Courier New" w:eastAsia="Times New Roman" w:hAnsi="Courier New" w:cs="Courier New"/>
+      <w:sz w:val="20"/>
+      <w:szCs w:val="20"/>
+    </w:rPr>
   </w:style>
 </w:styles>
 </file>
@@ -24729,7 +27725,7 @@
 </file>
 
 <file path=customXml/itemProps1.xml><?xml version="1.0" encoding="utf-8"?>
-<ds:datastoreItem xmlns:ds="http://schemas.openxmlformats.org/officeDocument/2006/customXml" ds:itemID="{EF278816-EC6F-A645-907D-7F25AECB1D4A}">
+<ds:datastoreItem xmlns:ds="http://schemas.openxmlformats.org/officeDocument/2006/customXml" ds:itemID="{85F08DA2-F3C0-4685-86CD-FF856602E9E9}">
   <ds:schemaRefs>
     <ds:schemaRef ds:uri="http://schemas.openxmlformats.org/officeDocument/2006/bibliography"/>
   </ds:schemaRefs>

</xml_diff>